<commit_message>
Update manual for GitHub+Netlify auto-deploy workflow
</commit_message>
<xml_diff>
--- a/定例報告_運用手順書.docx
+++ b/定例報告_運用手順書.docx
@@ -236,7 +236,7 @@
           <w:rFonts w:ascii="游ゴシック" w:hAnsi="游ゴシック" w:eastAsia="游ゴシック"/>
           <w:sz w:val="21"/>
         </w:rPr>
-        <w:t>Web公開：Netlify経由で携帯・他人とも共有可</w:t>
+        <w:t>Web公開：GitHub + Netlify 自動デプロイ（push したら数十秒で公開）</w:t>
       </w:r>
     </w:p>
     <w:p>
@@ -250,6 +250,73 @@
           <w:sz w:val="21"/>
         </w:rPr>
         <w:t>PWA対応：スマホのホーム画面に追加してアプリのように使える</w:t>
+      </w:r>
+    </w:p>
+    <w:p>
+      <w:pPr>
+        <w:pStyle w:val="ListBullet"/>
+        <w:spacing w:after="40"/>
+      </w:pPr>
+      <w:r>
+        <w:rPr>
+          <w:rFonts w:ascii="游ゴシック" w:hAnsi="游ゴシック" w:eastAsia="游ゴシック"/>
+          <w:sz w:val="21"/>
+        </w:rPr>
+        <w:t>ワンクリック公開：「GitHubに更新.bat」だけで全員に最新情報が配信される</w:t>
+      </w:r>
+    </w:p>
+    <w:p>
+      <w:pPr>
+        <w:spacing w:before="160" w:after="40"/>
+      </w:pPr>
+      <w:r>
+        <w:rPr>
+          <w:rFonts w:ascii="游ゴシック" w:hAnsi="游ゴシック" w:eastAsia="游ゴシック"/>
+          <w:b/>
+          <w:color w:val="1E3A8A"/>
+          <w:sz w:val="23"/>
+        </w:rPr>
+        <w:t>■ 公開URL</w:t>
+      </w:r>
+    </w:p>
+    <w:p>
+      <w:pPr>
+        <w:spacing w:after="80"/>
+      </w:pPr>
+      <w:r>
+        <w:rPr>
+          <w:rFonts w:ascii="游ゴシック" w:hAnsi="游ゴシック" w:eastAsia="游ゴシック"/>
+          <w:b w:val="0"/>
+          <w:sz w:val="21"/>
+        </w:rPr>
+        <w:t>https://teirei-houkoku.netlify.app</w:t>
+      </w:r>
+    </w:p>
+    <w:p>
+      <w:pPr>
+        <w:spacing w:before="160" w:after="40"/>
+      </w:pPr>
+      <w:r>
+        <w:rPr>
+          <w:rFonts w:ascii="游ゴシック" w:hAnsi="游ゴシック" w:eastAsia="游ゴシック"/>
+          <w:b/>
+          <w:color w:val="1E3A8A"/>
+          <w:sz w:val="23"/>
+        </w:rPr>
+        <w:t>■ GitHubリポジトリ</w:t>
+      </w:r>
+    </w:p>
+    <w:p>
+      <w:pPr>
+        <w:spacing w:after="80"/>
+      </w:pPr>
+      <w:r>
+        <w:rPr>
+          <w:rFonts w:ascii="游ゴシック" w:hAnsi="游ゴシック" w:eastAsia="游ゴシック"/>
+          <w:b w:val="0"/>
+          <w:sz w:val="21"/>
+        </w:rPr>
+        <w:t>https://github.com/abe2300/ebachan  （URL slug: ebachan、表示名: エバチャン）</w:t>
       </w:r>
     </w:p>
     <w:p>
@@ -533,7 +600,7 @@
                 <w:rFonts w:ascii="游ゴシック" w:hAnsi="游ゴシック" w:eastAsia="游ゴシック"/>
                 <w:sz w:val="20"/>
               </w:rPr>
-              <w:t>サーバー停止</w:t>
+              <w:t>ローカルサーバー停止</w:t>
             </w:r>
           </w:p>
         </w:tc>
@@ -549,7 +616,7 @@
                 <w:rFonts w:ascii="游ゴシック" w:hAnsi="游ゴシック" w:eastAsia="游ゴシック"/>
                 <w:sz w:val="20"/>
               </w:rPr>
-              <w:t>公開用を更新.bat</w:t>
+              <w:t>★ GitHubに更新.bat</w:t>
             </w:r>
           </w:p>
         </w:tc>
@@ -563,7 +630,7 @@
                 <w:rFonts w:ascii="游ゴシック" w:hAnsi="游ゴシック" w:eastAsia="游ゴシック"/>
                 <w:sz w:val="20"/>
               </w:rPr>
-              <w:t>Netlify公開用ファイルの更新</w:t>
+              <w:t>★ ワンクリックでgit push（毎日使う）</w:t>
             </w:r>
           </w:p>
         </w:tc>
@@ -579,7 +646,7 @@
                 <w:rFonts w:ascii="游ゴシック" w:hAnsi="游ゴシック" w:eastAsia="游ゴシック"/>
                 <w:sz w:val="20"/>
               </w:rPr>
-              <w:t>公開用/</w:t>
+              <w:t>朝の自動更新.bat</w:t>
             </w:r>
           </w:p>
         </w:tc>
@@ -593,7 +660,157 @@
                 <w:rFonts w:ascii="游ゴシック" w:hAnsi="游ゴシック" w:eastAsia="游ゴシック"/>
                 <w:sz w:val="20"/>
               </w:rPr>
-              <w:t>Netlifyにアップロードするフォルダ</w:t>
+              <w:t>毎朝7時の自動起動用（B案・タスクスケジューラ）</w:t>
+            </w:r>
+          </w:p>
+        </w:tc>
+      </w:tr>
+      <w:tr>
+        <w:tc>
+          <w:tcPr>
+            <w:tcW w:type="dxa" w:w="4986"/>
+          </w:tcPr>
+          <w:p>
+            <w:r>
+              <w:rPr>
+                <w:rFonts w:ascii="游ゴシック" w:hAnsi="游ゴシック" w:eastAsia="游ゴシック"/>
+                <w:sz w:val="20"/>
+              </w:rPr>
+              <w:t>タスクスケジューラ_設定.bat</w:t>
+            </w:r>
+          </w:p>
+        </w:tc>
+        <w:tc>
+          <w:tcPr>
+            <w:tcW w:type="dxa" w:w="4986"/>
+          </w:tcPr>
+          <w:p>
+            <w:r>
+              <w:rPr>
+                <w:rFonts w:ascii="游ゴシック" w:hAnsi="游ゴシック" w:eastAsia="游ゴシック"/>
+                <w:sz w:val="20"/>
+              </w:rPr>
+              <w:t>Windows タスクスケジューラ設定（B案セットアップ）</w:t>
+            </w:r>
+          </w:p>
+        </w:tc>
+      </w:tr>
+      <w:tr>
+        <w:tc>
+          <w:tcPr>
+            <w:tcW w:type="dxa" w:w="4986"/>
+          </w:tcPr>
+          <w:p>
+            <w:r>
+              <w:rPr>
+                <w:rFonts w:ascii="游ゴシック" w:hAnsi="游ゴシック" w:eastAsia="游ゴシック"/>
+                <w:sz w:val="20"/>
+              </w:rPr>
+              <w:t>タスクスケジューラ_解除.bat</w:t>
+            </w:r>
+          </w:p>
+        </w:tc>
+        <w:tc>
+          <w:tcPr>
+            <w:tcW w:type="dxa" w:w="4986"/>
+          </w:tcPr>
+          <w:p>
+            <w:r>
+              <w:rPr>
+                <w:rFonts w:ascii="游ゴシック" w:hAnsi="游ゴシック" w:eastAsia="游ゴシック"/>
+                <w:sz w:val="20"/>
+              </w:rPr>
+              <w:t>Windows タスクスケジューラ解除</w:t>
+            </w:r>
+          </w:p>
+        </w:tc>
+      </w:tr>
+      <w:tr>
+        <w:tc>
+          <w:tcPr>
+            <w:tcW w:type="dxa" w:w="4986"/>
+          </w:tcPr>
+          <w:p>
+            <w:r>
+              <w:rPr>
+                <w:rFonts w:ascii="游ゴシック" w:hAnsi="游ゴシック" w:eastAsia="游ゴシック"/>
+                <w:sz w:val="20"/>
+              </w:rPr>
+              <w:t>_自動更新の指示プロンプト.md</w:t>
+            </w:r>
+          </w:p>
+        </w:tc>
+        <w:tc>
+          <w:tcPr>
+            <w:tcW w:type="dxa" w:w="4986"/>
+          </w:tcPr>
+          <w:p>
+            <w:r>
+              <w:rPr>
+                <w:rFonts w:ascii="游ゴシック" w:hAnsi="游ゴシック" w:eastAsia="游ゴシック"/>
+                <w:sz w:val="20"/>
+              </w:rPr>
+              <w:t>/schedule復旧時のプロンプトテンプレート</w:t>
+            </w:r>
+          </w:p>
+        </w:tc>
+      </w:tr>
+      <w:tr>
+        <w:tc>
+          <w:tcPr>
+            <w:tcW w:type="dxa" w:w="4986"/>
+          </w:tcPr>
+          <w:p>
+            <w:r>
+              <w:rPr>
+                <w:rFonts w:ascii="游ゴシック" w:hAnsi="游ゴシック" w:eastAsia="游ゴシック"/>
+                <w:sz w:val="20"/>
+              </w:rPr>
+              <w:t>.git / .gitignore</w:t>
+            </w:r>
+          </w:p>
+        </w:tc>
+        <w:tc>
+          <w:tcPr>
+            <w:tcW w:type="dxa" w:w="4986"/>
+          </w:tcPr>
+          <w:p>
+            <w:r>
+              <w:rPr>
+                <w:rFonts w:ascii="游ゴシック" w:hAnsi="游ゴシック" w:eastAsia="游ゴシック"/>
+                <w:sz w:val="20"/>
+              </w:rPr>
+              <w:t>Git リポジトリ管理ファイル</w:t>
+            </w:r>
+          </w:p>
+        </w:tc>
+      </w:tr>
+      <w:tr>
+        <w:tc>
+          <w:tcPr>
+            <w:tcW w:type="dxa" w:w="4986"/>
+          </w:tcPr>
+          <w:p>
+            <w:r>
+              <w:rPr>
+                <w:rFonts w:ascii="游ゴシック" w:hAnsi="游ゴシック" w:eastAsia="游ゴシック"/>
+                <w:sz w:val="20"/>
+              </w:rPr>
+              <w:t>README.md</w:t>
+            </w:r>
+          </w:p>
+        </w:tc>
+        <w:tc>
+          <w:tcPr>
+            <w:tcW w:type="dxa" w:w="4986"/>
+          </w:tcPr>
+          <w:p>
+            <w:r>
+              <w:rPr>
+                <w:rFonts w:ascii="游ゴシック" w:hAnsi="游ゴシック" w:eastAsia="游ゴシック"/>
+                <w:sz w:val="20"/>
+              </w:rPr>
+              <w:t>GitHubで表示される説明書き</w:t>
             </w:r>
           </w:p>
         </w:tc>
@@ -624,6 +841,79 @@
                 <w:sz w:val="20"/>
               </w:rPr>
               <w:t>本手順書を再生成するスクリプト</w:t>
+            </w:r>
+          </w:p>
+        </w:tc>
+      </w:tr>
+      <w:tr>
+        <w:tc>
+          <w:tcPr>
+            <w:tcW w:type="dxa" w:w="4986"/>
+          </w:tcPr>
+          <w:p>
+            <w:r>
+              <w:rPr>
+                <w:rFonts w:ascii="游ゴシック" w:hAnsi="游ゴシック" w:eastAsia="游ゴシック"/>
+                <w:sz w:val="20"/>
+              </w:rPr>
+              <w:t>公開用/、公開用を更新.bat</w:t>
+            </w:r>
+          </w:p>
+        </w:tc>
+        <w:tc>
+          <w:tcPr>
+            <w:tcW w:type="dxa" w:w="4986"/>
+          </w:tcPr>
+          <w:p>
+            <w:r>
+              <w:rPr>
+                <w:rFonts w:ascii="游ゴシック" w:hAnsi="游ゴシック" w:eastAsia="游ゴシック"/>
+                <w:sz w:val="20"/>
+              </w:rPr>
+              <w:t>旧Netlify方式（GitHub連携後は使用しない）</w:t>
+            </w:r>
+          </w:p>
+        </w:tc>
+      </w:tr>
+    </w:tbl>
+    <w:p/>
+    <w:tbl>
+      <w:tblPr>
+        <w:tblW w:type="auto" w:w="0"/>
+        <w:tblLayout w:type="autofit"/>
+        <w:tblLook w:firstColumn="1" w:firstRow="1" w:lastColumn="0" w:lastRow="0" w:noHBand="0" w:noVBand="1" w:val="04A0"/>
+      </w:tblPr>
+      <w:tblGrid>
+        <w:gridCol w:w="9972"/>
+      </w:tblGrid>
+      <w:tr>
+        <w:tc>
+          <w:tcPr>
+            <w:tcW w:type="dxa" w:w="9972"/>
+            <w:shd w:val="clear" w:color="auto" w:fill="FFF8E1"/>
+            <w:tcBorders>
+              <w:top w:val="single" w:sz="8" w:color="F59E0B"/>
+              <w:left w:val="single" w:sz="8" w:color="F59E0B"/>
+              <w:bottom w:val="single" w:sz="8" w:color="F59E0B"/>
+              <w:right w:val="single" w:sz="8" w:color="F59E0B"/>
+            </w:tcBorders>
+          </w:tcPr>
+          <w:p>
+            <w:r>
+              <w:rPr>
+                <w:rFonts w:ascii="游ゴシック" w:hAnsi="游ゴシック" w:eastAsia="游ゴシック"/>
+                <w:sz w:val="20"/>
+              </w:rPr>
+              <w:t>★マークが付いているファイルが日常的によく使うものです。</w:t>
+            </w:r>
+          </w:p>
+          <w:p>
+            <w:r>
+              <w:rPr>
+                <w:rFonts w:ascii="游ゴシック" w:hAnsi="游ゴシック" w:eastAsia="游ゴシック"/>
+                <w:sz w:val="20"/>
+              </w:rPr>
+              <w:t>旧Netlify方式の「公開用」フォルダはGitHub連携で不要になりましたが、念のため残してあります。</w:t>
             </w:r>
           </w:p>
         </w:tc>
@@ -867,7 +1157,7 @@
           <w:color w:val="1E3A8A"/>
           <w:sz w:val="36"/>
         </w:rPr>
-        <w:t>4. 携帯・他人と共有する方法（Netlifyで公開）</w:t>
+        <w:t>4. Web公開・共有する方法（GitHub + Netlify 自動デプロイ）</w:t>
       </w:r>
     </w:p>
     <w:p>
@@ -880,7 +1170,7 @@
           <w:b w:val="0"/>
           <w:sz w:val="21"/>
         </w:rPr>
-        <w:t>Netlifyという無料サービスを使って、誰でもURLからアクセスできる公開サイトを作ります。PayPay運用管理と同じ仕組みです。</w:t>
+        <w:t>GitHubとNetlifyを連携させて、git push するだけで自動的にWebサイトが更新される仕組みを構築済みです。手動でNetlifyにファイルをアップする必要はありません。</w:t>
       </w:r>
     </w:p>
     <w:p>
@@ -894,7 +1184,534 @@
           <w:color w:val="333333"/>
           <w:sz w:val="27"/>
         </w:rPr>
-        <w:t>初回セットアップ（最初の1回だけ）</w:t>
+        <w:t>4-1. 全体の仕組み（既に構築済み）</w:t>
+      </w:r>
+    </w:p>
+    <w:p>
+      <w:pPr>
+        <w:spacing w:after="80"/>
+      </w:pPr>
+      <w:r>
+        <w:rPr>
+          <w:rFonts w:ascii="游ゴシック" w:hAnsi="游ゴシック" w:eastAsia="游ゴシック"/>
+          <w:b w:val="0"/>
+          <w:sz w:val="21"/>
+        </w:rPr>
+        <w:t>以下の自動連携が既に完成しています。</w:t>
+      </w:r>
+    </w:p>
+    <w:tbl>
+      <w:tblPr>
+        <w:tblStyle w:val="LightGrid-Accent1"/>
+        <w:tblW w:type="auto" w:w="0"/>
+        <w:tblLook w:firstColumn="1" w:firstRow="1" w:lastColumn="0" w:lastRow="0" w:noHBand="0" w:noVBand="1" w:val="04A0"/>
+      </w:tblPr>
+      <w:tblGrid>
+        <w:gridCol w:w="4986"/>
+        <w:gridCol w:w="4986"/>
+      </w:tblGrid>
+      <w:tr>
+        <w:tc>
+          <w:tcPr>
+            <w:tcW w:type="dxa" w:w="4986"/>
+            <w:shd w:val="clear" w:color="auto" w:fill="1E3A8A"/>
+          </w:tcPr>
+          <w:p>
+            <w:r>
+              <w:rPr>
+                <w:rFonts w:ascii="游ゴシック" w:hAnsi="游ゴシック" w:eastAsia="游ゴシック"/>
+                <w:b/>
+                <w:color w:val="FFFFFF"/>
+                <w:sz w:val="21"/>
+              </w:rPr>
+              <w:t>段階</w:t>
+            </w:r>
+          </w:p>
+        </w:tc>
+        <w:tc>
+          <w:tcPr>
+            <w:tcW w:type="dxa" w:w="4986"/>
+            <w:shd w:val="clear" w:color="auto" w:fill="1E3A8A"/>
+          </w:tcPr>
+          <w:p>
+            <w:r>
+              <w:rPr>
+                <w:rFonts w:ascii="游ゴシック" w:hAnsi="游ゴシック" w:eastAsia="游ゴシック"/>
+                <w:b/>
+                <w:color w:val="FFFFFF"/>
+                <w:sz w:val="21"/>
+              </w:rPr>
+              <w:t>内容</w:t>
+            </w:r>
+          </w:p>
+        </w:tc>
+      </w:tr>
+      <w:tr>
+        <w:tc>
+          <w:tcPr>
+            <w:tcW w:type="dxa" w:w="4986"/>
+          </w:tcPr>
+          <w:p>
+            <w:r>
+              <w:rPr>
+                <w:rFonts w:ascii="游ゴシック" w:hAnsi="游ゴシック" w:eastAsia="游ゴシック"/>
+                <w:sz w:val="20"/>
+              </w:rPr>
+              <w:t>①</w:t>
+            </w:r>
+          </w:p>
+        </w:tc>
+        <w:tc>
+          <w:tcPr>
+            <w:tcW w:type="dxa" w:w="4986"/>
+          </w:tcPr>
+          <w:p>
+            <w:r>
+              <w:rPr>
+                <w:rFonts w:ascii="游ゴシック" w:hAnsi="游ゴシック" w:eastAsia="游ゴシック"/>
+                <w:sz w:val="20"/>
+              </w:rPr>
+              <w:t>ローカルの index.html を編集</w:t>
+            </w:r>
+          </w:p>
+        </w:tc>
+      </w:tr>
+      <w:tr>
+        <w:tc>
+          <w:tcPr>
+            <w:tcW w:type="dxa" w:w="4986"/>
+          </w:tcPr>
+          <w:p>
+            <w:r>
+              <w:rPr>
+                <w:rFonts w:ascii="游ゴシック" w:hAnsi="游ゴシック" w:eastAsia="游ゴシック"/>
+                <w:sz w:val="20"/>
+              </w:rPr>
+              <w:t>②</w:t>
+            </w:r>
+          </w:p>
+        </w:tc>
+        <w:tc>
+          <w:tcPr>
+            <w:tcW w:type="dxa" w:w="4986"/>
+          </w:tcPr>
+          <w:p>
+            <w:r>
+              <w:rPr>
+                <w:rFonts w:ascii="游ゴシック" w:hAnsi="游ゴシック" w:eastAsia="游ゴシック"/>
+                <w:sz w:val="20"/>
+              </w:rPr>
+              <w:t>「GitHubに更新.bat」をダブルクリック</w:t>
+            </w:r>
+          </w:p>
+        </w:tc>
+      </w:tr>
+      <w:tr>
+        <w:tc>
+          <w:tcPr>
+            <w:tcW w:type="dxa" w:w="4986"/>
+          </w:tcPr>
+          <w:p>
+            <w:r>
+              <w:rPr>
+                <w:rFonts w:ascii="游ゴシック" w:hAnsi="游ゴシック" w:eastAsia="游ゴシック"/>
+                <w:sz w:val="20"/>
+              </w:rPr>
+              <w:t>③</w:t>
+            </w:r>
+          </w:p>
+        </w:tc>
+        <w:tc>
+          <w:tcPr>
+            <w:tcW w:type="dxa" w:w="4986"/>
+          </w:tcPr>
+          <w:p>
+            <w:r>
+              <w:rPr>
+                <w:rFonts w:ascii="游ゴシック" w:hAnsi="游ゴシック" w:eastAsia="游ゴシック"/>
+                <w:sz w:val="20"/>
+              </w:rPr>
+              <w:t>自動で git add → commit → push が実行される</w:t>
+            </w:r>
+          </w:p>
+        </w:tc>
+      </w:tr>
+      <w:tr>
+        <w:tc>
+          <w:tcPr>
+            <w:tcW w:type="dxa" w:w="4986"/>
+          </w:tcPr>
+          <w:p>
+            <w:r>
+              <w:rPr>
+                <w:rFonts w:ascii="游ゴシック" w:hAnsi="游ゴシック" w:eastAsia="游ゴシック"/>
+                <w:sz w:val="20"/>
+              </w:rPr>
+              <w:t>④</w:t>
+            </w:r>
+          </w:p>
+        </w:tc>
+        <w:tc>
+          <w:tcPr>
+            <w:tcW w:type="dxa" w:w="4986"/>
+          </w:tcPr>
+          <w:p>
+            <w:r>
+              <w:rPr>
+                <w:rFonts w:ascii="游ゴシック" w:hAnsi="游ゴシック" w:eastAsia="游ゴシック"/>
+                <w:sz w:val="20"/>
+              </w:rPr>
+              <w:t>GitHubのリポジトリ（abe2300/ebachan）に反映</w:t>
+            </w:r>
+          </w:p>
+        </w:tc>
+      </w:tr>
+      <w:tr>
+        <w:tc>
+          <w:tcPr>
+            <w:tcW w:type="dxa" w:w="4986"/>
+          </w:tcPr>
+          <w:p>
+            <w:r>
+              <w:rPr>
+                <w:rFonts w:ascii="游ゴシック" w:hAnsi="游ゴシック" w:eastAsia="游ゴシック"/>
+                <w:sz w:val="20"/>
+              </w:rPr>
+              <w:t>⑤</w:t>
+            </w:r>
+          </w:p>
+        </w:tc>
+        <w:tc>
+          <w:tcPr>
+            <w:tcW w:type="dxa" w:w="4986"/>
+          </w:tcPr>
+          <w:p>
+            <w:r>
+              <w:rPr>
+                <w:rFonts w:ascii="游ゴシック" w:hAnsi="游ゴシック" w:eastAsia="游ゴシック"/>
+                <w:sz w:val="20"/>
+              </w:rPr>
+              <w:t>Netlifyが自動検知して新ビルドをデプロイ</w:t>
+            </w:r>
+          </w:p>
+        </w:tc>
+      </w:tr>
+      <w:tr>
+        <w:tc>
+          <w:tcPr>
+            <w:tcW w:type="dxa" w:w="4986"/>
+          </w:tcPr>
+          <w:p>
+            <w:r>
+              <w:rPr>
+                <w:rFonts w:ascii="游ゴシック" w:hAnsi="游ゴシック" w:eastAsia="游ゴシック"/>
+                <w:sz w:val="20"/>
+              </w:rPr>
+              <w:t>⑥</w:t>
+            </w:r>
+          </w:p>
+        </w:tc>
+        <w:tc>
+          <w:tcPr>
+            <w:tcW w:type="dxa" w:w="4986"/>
+          </w:tcPr>
+          <w:p>
+            <w:r>
+              <w:rPr>
+                <w:rFonts w:ascii="游ゴシック" w:hAnsi="游ゴシック" w:eastAsia="游ゴシック"/>
+                <w:sz w:val="20"/>
+              </w:rPr>
+              <w:t>数秒〜30秒で https://teirei-houkoku.netlify.app に公開</w:t>
+            </w:r>
+          </w:p>
+        </w:tc>
+      </w:tr>
+    </w:tbl>
+    <w:p/>
+    <w:p>
+      <w:pPr>
+        <w:spacing w:before="240" w:after="80"/>
+      </w:pPr>
+      <w:r>
+        <w:rPr>
+          <w:rFonts w:ascii="游ゴシック" w:hAnsi="游ゴシック" w:eastAsia="游ゴシック"/>
+          <w:b/>
+          <w:color w:val="333333"/>
+          <w:sz w:val="27"/>
+        </w:rPr>
+        <w:t>4-2. 設定情報（既に完了済み）</w:t>
+      </w:r>
+    </w:p>
+    <w:tbl>
+      <w:tblPr>
+        <w:tblStyle w:val="LightGrid-Accent1"/>
+        <w:tblW w:type="auto" w:w="0"/>
+        <w:tblLook w:firstColumn="1" w:firstRow="1" w:lastColumn="0" w:lastRow="0" w:noHBand="0" w:noVBand="1" w:val="04A0"/>
+      </w:tblPr>
+      <w:tblGrid>
+        <w:gridCol w:w="4986"/>
+        <w:gridCol w:w="4986"/>
+      </w:tblGrid>
+      <w:tr>
+        <w:tc>
+          <w:tcPr>
+            <w:tcW w:type="dxa" w:w="4986"/>
+            <w:shd w:val="clear" w:color="auto" w:fill="1E3A8A"/>
+          </w:tcPr>
+          <w:p>
+            <w:r>
+              <w:rPr>
+                <w:rFonts w:ascii="游ゴシック" w:hAnsi="游ゴシック" w:eastAsia="游ゴシック"/>
+                <w:b/>
+                <w:color w:val="FFFFFF"/>
+                <w:sz w:val="21"/>
+              </w:rPr>
+              <w:t>項目</w:t>
+            </w:r>
+          </w:p>
+        </w:tc>
+        <w:tc>
+          <w:tcPr>
+            <w:tcW w:type="dxa" w:w="4986"/>
+            <w:shd w:val="clear" w:color="auto" w:fill="1E3A8A"/>
+          </w:tcPr>
+          <w:p>
+            <w:r>
+              <w:rPr>
+                <w:rFonts w:ascii="游ゴシック" w:hAnsi="游ゴシック" w:eastAsia="游ゴシック"/>
+                <w:b/>
+                <w:color w:val="FFFFFF"/>
+                <w:sz w:val="21"/>
+              </w:rPr>
+              <w:t>値</w:t>
+            </w:r>
+          </w:p>
+        </w:tc>
+      </w:tr>
+      <w:tr>
+        <w:tc>
+          <w:tcPr>
+            <w:tcW w:type="dxa" w:w="4986"/>
+          </w:tcPr>
+          <w:p>
+            <w:r>
+              <w:rPr>
+                <w:rFonts w:ascii="游ゴシック" w:hAnsi="游ゴシック" w:eastAsia="游ゴシック"/>
+                <w:sz w:val="20"/>
+              </w:rPr>
+              <w:t>公開URL</w:t>
+            </w:r>
+          </w:p>
+        </w:tc>
+        <w:tc>
+          <w:tcPr>
+            <w:tcW w:type="dxa" w:w="4986"/>
+          </w:tcPr>
+          <w:p>
+            <w:r>
+              <w:rPr>
+                <w:rFonts w:ascii="游ゴシック" w:hAnsi="游ゴシック" w:eastAsia="游ゴシック"/>
+                <w:sz w:val="20"/>
+              </w:rPr>
+              <w:t>https://teirei-houkoku.netlify.app</w:t>
+            </w:r>
+          </w:p>
+        </w:tc>
+      </w:tr>
+      <w:tr>
+        <w:tc>
+          <w:tcPr>
+            <w:tcW w:type="dxa" w:w="4986"/>
+          </w:tcPr>
+          <w:p>
+            <w:r>
+              <w:rPr>
+                <w:rFonts w:ascii="游ゴシック" w:hAnsi="游ゴシック" w:eastAsia="游ゴシック"/>
+                <w:sz w:val="20"/>
+              </w:rPr>
+              <w:t>GitHubリポジトリ</w:t>
+            </w:r>
+          </w:p>
+        </w:tc>
+        <w:tc>
+          <w:tcPr>
+            <w:tcW w:type="dxa" w:w="4986"/>
+          </w:tcPr>
+          <w:p>
+            <w:r>
+              <w:rPr>
+                <w:rFonts w:ascii="游ゴシック" w:hAnsi="游ゴシック" w:eastAsia="游ゴシック"/>
+                <w:sz w:val="20"/>
+              </w:rPr>
+              <w:t>https://github.com/abe2300/ebachan</w:t>
+            </w:r>
+          </w:p>
+        </w:tc>
+      </w:tr>
+      <w:tr>
+        <w:tc>
+          <w:tcPr>
+            <w:tcW w:type="dxa" w:w="4986"/>
+          </w:tcPr>
+          <w:p>
+            <w:r>
+              <w:rPr>
+                <w:rFonts w:ascii="游ゴシック" w:hAnsi="游ゴシック" w:eastAsia="游ゴシック"/>
+                <w:sz w:val="20"/>
+              </w:rPr>
+              <w:t>Netlifyプロジェクト名</w:t>
+            </w:r>
+          </w:p>
+        </w:tc>
+        <w:tc>
+          <w:tcPr>
+            <w:tcW w:type="dxa" w:w="4986"/>
+          </w:tcPr>
+          <w:p>
+            <w:r>
+              <w:rPr>
+                <w:rFonts w:ascii="游ゴシック" w:hAnsi="游ゴシック" w:eastAsia="游ゴシック"/>
+                <w:sz w:val="20"/>
+              </w:rPr>
+              <w:t>teirei-houkoku</w:t>
+            </w:r>
+          </w:p>
+        </w:tc>
+      </w:tr>
+      <w:tr>
+        <w:tc>
+          <w:tcPr>
+            <w:tcW w:type="dxa" w:w="4986"/>
+          </w:tcPr>
+          <w:p>
+            <w:r>
+              <w:rPr>
+                <w:rFonts w:ascii="游ゴシック" w:hAnsi="游ゴシック" w:eastAsia="游ゴシック"/>
+                <w:sz w:val="20"/>
+              </w:rPr>
+              <w:t>デプロイブランチ</w:t>
+            </w:r>
+          </w:p>
+        </w:tc>
+        <w:tc>
+          <w:tcPr>
+            <w:tcW w:type="dxa" w:w="4986"/>
+          </w:tcPr>
+          <w:p>
+            <w:r>
+              <w:rPr>
+                <w:rFonts w:ascii="游ゴシック" w:hAnsi="游ゴシック" w:eastAsia="游ゴシック"/>
+                <w:sz w:val="20"/>
+              </w:rPr>
+              <w:t>main</w:t>
+            </w:r>
+          </w:p>
+        </w:tc>
+      </w:tr>
+      <w:tr>
+        <w:tc>
+          <w:tcPr>
+            <w:tcW w:type="dxa" w:w="4986"/>
+          </w:tcPr>
+          <w:p>
+            <w:r>
+              <w:rPr>
+                <w:rFonts w:ascii="游ゴシック" w:hAnsi="游ゴシック" w:eastAsia="游ゴシック"/>
+                <w:sz w:val="20"/>
+              </w:rPr>
+              <w:t>デプロイ方式</w:t>
+            </w:r>
+          </w:p>
+        </w:tc>
+        <w:tc>
+          <w:tcPr>
+            <w:tcW w:type="dxa" w:w="4986"/>
+          </w:tcPr>
+          <w:p>
+            <w:r>
+              <w:rPr>
+                <w:rFonts w:ascii="游ゴシック" w:hAnsi="游ゴシック" w:eastAsia="游ゴシック"/>
+                <w:sz w:val="20"/>
+              </w:rPr>
+              <w:t>GitHub連携・push検知で自動デプロイ</w:t>
+            </w:r>
+          </w:p>
+        </w:tc>
+      </w:tr>
+      <w:tr>
+        <w:tc>
+          <w:tcPr>
+            <w:tcW w:type="dxa" w:w="4986"/>
+          </w:tcPr>
+          <w:p>
+            <w:r>
+              <w:rPr>
+                <w:rFonts w:ascii="游ゴシック" w:hAnsi="游ゴシック" w:eastAsia="游ゴシック"/>
+                <w:sz w:val="20"/>
+              </w:rPr>
+              <w:t>Git ユーザー名</w:t>
+            </w:r>
+          </w:p>
+        </w:tc>
+        <w:tc>
+          <w:tcPr>
+            <w:tcW w:type="dxa" w:w="4986"/>
+          </w:tcPr>
+          <w:p>
+            <w:r>
+              <w:rPr>
+                <w:rFonts w:ascii="游ゴシック" w:hAnsi="游ゴシック" w:eastAsia="游ゴシック"/>
+                <w:sz w:val="20"/>
+              </w:rPr>
+              <w:t>abe2300</w:t>
+            </w:r>
+          </w:p>
+        </w:tc>
+      </w:tr>
+      <w:tr>
+        <w:tc>
+          <w:tcPr>
+            <w:tcW w:type="dxa" w:w="4986"/>
+          </w:tcPr>
+          <w:p>
+            <w:r>
+              <w:rPr>
+                <w:rFonts w:ascii="游ゴシック" w:hAnsi="游ゴシック" w:eastAsia="游ゴシック"/>
+                <w:sz w:val="20"/>
+              </w:rPr>
+              <w:t>Git メールアドレス</w:t>
+            </w:r>
+          </w:p>
+        </w:tc>
+        <w:tc>
+          <w:tcPr>
+            <w:tcW w:type="dxa" w:w="4986"/>
+          </w:tcPr>
+          <w:p>
+            <w:r>
+              <w:rPr>
+                <w:rFonts w:ascii="游ゴシック" w:hAnsi="游ゴシック" w:eastAsia="游ゴシック"/>
+                <w:sz w:val="20"/>
+              </w:rPr>
+              <w:t>a161046@gmail.com</w:t>
+            </w:r>
+          </w:p>
+        </w:tc>
+      </w:tr>
+    </w:tbl>
+    <w:p/>
+    <w:p>
+      <w:pPr>
+        <w:spacing w:before="240" w:after="80"/>
+      </w:pPr>
+      <w:r>
+        <w:rPr>
+          <w:rFonts w:ascii="游ゴシック" w:hAnsi="游ゴシック" w:eastAsia="游ゴシック"/>
+          <w:b/>
+          <w:color w:val="333333"/>
+          <w:sz w:val="27"/>
+        </w:rPr>
+        <w:t>4-3. ワンクリック公開の使い方</w:t>
       </w:r>
     </w:p>
     <w:p>
@@ -907,7 +1724,7 @@
           <w:rFonts w:ascii="游ゴシック" w:hAnsi="游ゴシック" w:eastAsia="游ゴシック"/>
           <w:sz w:val="21"/>
         </w:rPr>
-        <w:t>ブラウザで https://app.netlify.com/ にアクセス</w:t>
+        <w:t>Claude Code で「定例報告」と入力し、index.html を更新してもらう</w:t>
       </w:r>
     </w:p>
     <w:p>
@@ -920,7 +1737,7 @@
           <w:rFonts w:ascii="游ゴシック" w:hAnsi="游ゴシック" w:eastAsia="游ゴシック"/>
           <w:sz w:val="21"/>
         </w:rPr>
-        <w:t>PayPay運用管理用のアカウントでログイン（または新規作成）</w:t>
+        <w:t>デスクトップまたはフォルダ内の「GitHubに更新.bat」をダブルクリック</w:t>
       </w:r>
     </w:p>
     <w:p>
@@ -933,7 +1750,7 @@
           <w:rFonts w:ascii="游ゴシック" w:hAnsi="游ゴシック" w:eastAsia="游ゴシック"/>
           <w:sz w:val="21"/>
         </w:rPr>
-        <w:t>「Add new site」→「Deploy manually」をクリック</w:t>
+        <w:t>黒い画面で進行状況が表示される</w:t>
       </w:r>
     </w:p>
     <w:p>
@@ -946,7 +1763,7 @@
           <w:rFonts w:ascii="游ゴシック" w:hAnsi="游ゴシック" w:eastAsia="游ゴシック"/>
           <w:sz w:val="21"/>
         </w:rPr>
-        <w:t>「定例報告 &gt; 公開用」フォルダをページにドラッグ＆ドロップ</w:t>
+        <w:t>「Push成功!」メッセージが出れば完了</w:t>
       </w:r>
     </w:p>
     <w:p>
@@ -959,20 +1776,7 @@
           <w:rFonts w:ascii="游ゴシック" w:hAnsi="游ゴシック" w:eastAsia="游ゴシック"/>
           <w:sz w:val="21"/>
         </w:rPr>
-        <w:t>自動でURLが発行される（例：https://teirei-houkoku-xxx.netlify.app）</w:t>
-      </w:r>
-    </w:p>
-    <w:p>
-      <w:pPr>
-        <w:pStyle w:val="ListNumber"/>
-        <w:spacing w:after="40"/>
-      </w:pPr>
-      <w:r>
-        <w:rPr>
-          <w:rFonts w:ascii="游ゴシック" w:hAnsi="游ゴシック" w:eastAsia="游ゴシック"/>
-          <w:sz w:val="21"/>
-        </w:rPr>
-        <w:t>発行されたURLをメモ・ブックマークしておく</w:t>
+        <w:t>30秒以内に公開URLで最新版を確認できる</w:t>
       </w:r>
     </w:p>
     <w:tbl>
@@ -1002,7 +1806,7 @@
                 <w:rFonts w:ascii="游ゴシック" w:hAnsi="游ゴシック" w:eastAsia="游ゴシック"/>
                 <w:sz w:val="20"/>
               </w:rPr>
-              <w:t>⚠️ 注意：URLは複雑な文字列で発行されます。Netlifyの「Site settings」→「Change site name」で覚えやすい名前に変更できます。</w:t>
+              <w:t>💡 ヒント：「GitHubに更新.bat」を右クリック→「ショートカットの作成」でデスクトップに置いておくと便利です。</w:t>
             </w:r>
           </w:p>
         </w:tc>
@@ -1020,12 +1824,12 @@
           <w:color w:val="333333"/>
           <w:sz w:val="27"/>
         </w:rPr>
-        <w:t>内容を更新する手順（毎回）</w:t>
+        <w:t>4-4. 共有方法</w:t>
       </w:r>
     </w:p>
     <w:p>
       <w:pPr>
-        <w:pStyle w:val="ListNumber"/>
+        <w:pStyle w:val="ListBullet"/>
         <w:spacing w:after="40"/>
       </w:pPr>
       <w:r>
@@ -1033,12 +1837,12 @@
           <w:rFonts w:ascii="游ゴシック" w:hAnsi="游ゴシック" w:eastAsia="游ゴシック"/>
           <w:sz w:val="21"/>
         </w:rPr>
-        <w:t>「公開用を更新.bat」をダブルクリック</w:t>
+        <w:t>公開URLをLINE・メール・Teams・社内チャットで送るだけ</w:t>
       </w:r>
     </w:p>
     <w:p>
       <w:pPr>
-        <w:pStyle w:val="ListNumber"/>
+        <w:pStyle w:val="ListBullet"/>
         <w:spacing w:after="40"/>
       </w:pPr>
       <w:r>
@@ -1046,12 +1850,12 @@
           <w:rFonts w:ascii="游ゴシック" w:hAnsi="游ゴシック" w:eastAsia="游ゴシック"/>
           <w:sz w:val="21"/>
         </w:rPr>
-        <w:t>最新の index.html などが「公開用」フォルダにコピーされる</w:t>
+        <w:t>受け取った人はブラウザでURLを開くだけで閲覧可能</w:t>
       </w:r>
     </w:p>
     <w:p>
       <w:pPr>
-        <w:pStyle w:val="ListNumber"/>
+        <w:pStyle w:val="ListBullet"/>
         <w:spacing w:after="40"/>
       </w:pPr>
       <w:r>
@@ -1059,12 +1863,12 @@
           <w:rFonts w:ascii="游ゴシック" w:hAnsi="游ゴシック" w:eastAsia="游ゴシック"/>
           <w:sz w:val="21"/>
         </w:rPr>
-        <w:t>ブラウザで Netlify ダッシュボードを開く</w:t>
+        <w:t>スマホでも同じURLでアクセス可能（PWA化も可）</w:t>
       </w:r>
     </w:p>
     <w:p>
       <w:pPr>
-        <w:pStyle w:val="ListNumber"/>
+        <w:pStyle w:val="ListBullet"/>
         <w:spacing w:after="40"/>
       </w:pPr>
       <w:r>
@@ -1072,33 +1876,7 @@
           <w:rFonts w:ascii="游ゴシック" w:hAnsi="游ゴシック" w:eastAsia="游ゴシック"/>
           <w:sz w:val="21"/>
         </w:rPr>
-        <w:t>対象サイトを選択→「Deploys」タブ→「Production deploys」エリアへ</w:t>
-      </w:r>
-    </w:p>
-    <w:p>
-      <w:pPr>
-        <w:pStyle w:val="ListNumber"/>
-        <w:spacing w:after="40"/>
-      </w:pPr>
-      <w:r>
-        <w:rPr>
-          <w:rFonts w:ascii="游ゴシック" w:hAnsi="游ゴシック" w:eastAsia="游ゴシック"/>
-          <w:sz w:val="21"/>
-        </w:rPr>
-        <w:t>「公開用」フォルダをドラッグ＆ドロップ</w:t>
-      </w:r>
-    </w:p>
-    <w:p>
-      <w:pPr>
-        <w:pStyle w:val="ListNumber"/>
-        <w:spacing w:after="40"/>
-      </w:pPr>
-      <w:r>
-        <w:rPr>
-          <w:rFonts w:ascii="游ゴシック" w:hAnsi="游ゴシック" w:eastAsia="游ゴシック"/>
-          <w:sz w:val="21"/>
-        </w:rPr>
-        <w:t>数秒〜数十秒でサイトが更新される</w:t>
+        <w:t>常に最新版が表示される（受け取り側で更新作業不要）</w:t>
       </w:r>
     </w:p>
     <w:p>
@@ -1112,7 +1890,7 @@
           <w:color w:val="333333"/>
           <w:sz w:val="27"/>
         </w:rPr>
-        <w:t>共有方法</w:t>
+        <w:t>4-5. セキュリティと制限</w:t>
       </w:r>
     </w:p>
     <w:p>
@@ -1125,7 +1903,7 @@
           <w:rFonts w:ascii="游ゴシック" w:hAnsi="游ゴシック" w:eastAsia="游ゴシック"/>
           <w:sz w:val="21"/>
         </w:rPr>
-        <w:t>発行されたURLをLINE・メール・Teamsなどで送信</w:t>
+        <w:t>リポジトリは Public（公開）設定 — コードは誰でも閲覧可能</w:t>
       </w:r>
     </w:p>
     <w:p>
@@ -1138,7 +1916,7 @@
           <w:rFonts w:ascii="游ゴシック" w:hAnsi="游ゴシック" w:eastAsia="游ゴシック"/>
           <w:sz w:val="21"/>
         </w:rPr>
-        <w:t>受け取った人はブラウザでURLを開くだけ</w:t>
+        <w:t>ただし業務上の機密情報は含まれていない（ニュース・税制情報のみ）</w:t>
       </w:r>
     </w:p>
     <w:p>
@@ -1151,7 +1929,33 @@
           <w:rFonts w:ascii="游ゴシック" w:hAnsi="游ゴシック" w:eastAsia="游ゴシック"/>
           <w:sz w:val="21"/>
         </w:rPr>
-        <w:t>スマホでアクセスして「ホーム画面に追加」すればアプリ風に使える</w:t>
+        <w:t>URLを知っている人全員がアプリにアクセス可能</w:t>
+      </w:r>
+    </w:p>
+    <w:p>
+      <w:pPr>
+        <w:pStyle w:val="ListBullet"/>
+        <w:spacing w:after="40"/>
+      </w:pPr>
+      <w:r>
+        <w:rPr>
+          <w:rFonts w:ascii="游ゴシック" w:hAnsi="游ゴシック" w:eastAsia="游ゴシック"/>
+          <w:sz w:val="21"/>
+        </w:rPr>
+        <w:t>Netlify無料枠：月間100GB帯域（個人利用では十分）</w:t>
+      </w:r>
+    </w:p>
+    <w:p>
+      <w:pPr>
+        <w:pStyle w:val="ListBullet"/>
+        <w:spacing w:after="40"/>
+      </w:pPr>
+      <w:r>
+        <w:rPr>
+          <w:rFonts w:ascii="游ゴシック" w:hAnsi="游ゴシック" w:eastAsia="游ゴシック"/>
+          <w:sz w:val="21"/>
+        </w:rPr>
+        <w:t>GitHub無料枠：Public無制限、Privateも一定枠まで無料</w:t>
       </w:r>
     </w:p>
     <w:p>
@@ -1165,46 +1969,20 @@
           <w:color w:val="333333"/>
           <w:sz w:val="27"/>
         </w:rPr>
-        <w:t>制限・セキュリティ</w:t>
+        <w:t>4-6. 旧Netlify方式について（参考）</w:t>
       </w:r>
     </w:p>
     <w:p>
       <w:pPr>
-        <w:pStyle w:val="ListBullet"/>
-        <w:spacing w:after="40"/>
+        <w:spacing w:after="80"/>
       </w:pPr>
       <w:r>
         <w:rPr>
           <w:rFonts w:ascii="游ゴシック" w:hAnsi="游ゴシック" w:eastAsia="游ゴシック"/>
+          <w:b w:val="0"/>
           <w:sz w:val="21"/>
         </w:rPr>
-        <w:t>Netlify無料枠：月間100GB帯域、十分すぎる容量</w:t>
-      </w:r>
-    </w:p>
-    <w:p>
-      <w:pPr>
-        <w:pStyle w:val="ListBullet"/>
-        <w:spacing w:after="40"/>
-      </w:pPr>
-      <w:r>
-        <w:rPr>
-          <w:rFonts w:ascii="游ゴシック" w:hAnsi="游ゴシック" w:eastAsia="游ゴシック"/>
-          <w:sz w:val="21"/>
-        </w:rPr>
-        <w:t>URLを知っている人全員がアクセス可能</w:t>
-      </w:r>
-    </w:p>
-    <w:p>
-      <w:pPr>
-        <w:pStyle w:val="ListBullet"/>
-        <w:spacing w:after="40"/>
-      </w:pPr>
-      <w:r>
-        <w:rPr>
-          <w:rFonts w:ascii="游ゴシック" w:hAnsi="游ゴシック" w:eastAsia="游ゴシック"/>
-          <w:sz w:val="21"/>
-        </w:rPr>
-        <w:t>非公開にしたい場合：Netlify有料プランでパスワード保護可能</w:t>
+        <w:t>以前は「公開用」フォルダをNetlifyにドラッグする方式でしたが、GitHub連携でこの手順は不要になりました。「公開用」フォルダと「公開用を更新.bat」は念のため残してありますが、通常は使いません。</w:t>
       </w:r>
     </w:p>
     <w:p>
@@ -1418,6 +2196,265 @@
     <w:p/>
     <w:p>
       <w:pPr>
+        <w:spacing w:before="240" w:after="80"/>
+      </w:pPr>
+      <w:r>
+        <w:rPr>
+          <w:rFonts w:ascii="游ゴシック" w:hAnsi="游ゴシック" w:eastAsia="游ゴシック"/>
+          <w:b/>
+          <w:color w:val="333333"/>
+          <w:sz w:val="27"/>
+        </w:rPr>
+        <w:t>5-3. スマホでの編集について（重要）</w:t>
+      </w:r>
+    </w:p>
+    <w:p>
+      <w:pPr>
+        <w:spacing w:after="80"/>
+      </w:pPr>
+      <w:r>
+        <w:rPr>
+          <w:rFonts w:ascii="游ゴシック" w:hAnsi="游ゴシック" w:eastAsia="游ゴシック"/>
+          <w:b w:val="0"/>
+          <w:sz w:val="21"/>
+        </w:rPr>
+        <w:t>スマホはClaude.aiのchat機能のみのため、ファイルを直接編集することができません。スマホは閲覧専用と考えてください。</w:t>
+      </w:r>
+    </w:p>
+    <w:tbl>
+      <w:tblPr>
+        <w:tblStyle w:val="LightGrid-Accent1"/>
+        <w:tblW w:type="auto" w:w="0"/>
+        <w:tblLook w:firstColumn="1" w:firstRow="1" w:lastColumn="0" w:lastRow="0" w:noHBand="0" w:noVBand="1" w:val="04A0"/>
+      </w:tblPr>
+      <w:tblGrid>
+        <w:gridCol w:w="3324"/>
+        <w:gridCol w:w="3324"/>
+        <w:gridCol w:w="3324"/>
+      </w:tblGrid>
+      <w:tr>
+        <w:tc>
+          <w:tcPr>
+            <w:tcW w:type="dxa" w:w="3324"/>
+            <w:shd w:val="clear" w:color="auto" w:fill="1E3A8A"/>
+          </w:tcPr>
+          <w:p>
+            <w:r>
+              <w:rPr>
+                <w:rFonts w:ascii="游ゴシック" w:hAnsi="游ゴシック" w:eastAsia="游ゴシック"/>
+                <w:b/>
+                <w:color w:val="FFFFFF"/>
+                <w:sz w:val="21"/>
+              </w:rPr>
+              <w:t>環境</w:t>
+            </w:r>
+          </w:p>
+        </w:tc>
+        <w:tc>
+          <w:tcPr>
+            <w:tcW w:type="dxa" w:w="3324"/>
+            <w:shd w:val="clear" w:color="auto" w:fill="1E3A8A"/>
+          </w:tcPr>
+          <w:p>
+            <w:r>
+              <w:rPr>
+                <w:rFonts w:ascii="游ゴシック" w:hAnsi="游ゴシック" w:eastAsia="游ゴシック"/>
+                <w:b/>
+                <w:color w:val="FFFFFF"/>
+                <w:sz w:val="21"/>
+              </w:rPr>
+              <w:t>閲覧</w:t>
+            </w:r>
+          </w:p>
+        </w:tc>
+        <w:tc>
+          <w:tcPr>
+            <w:tcW w:type="dxa" w:w="3324"/>
+            <w:shd w:val="clear" w:color="auto" w:fill="1E3A8A"/>
+          </w:tcPr>
+          <w:p>
+            <w:r>
+              <w:rPr>
+                <w:rFonts w:ascii="游ゴシック" w:hAnsi="游ゴシック" w:eastAsia="游ゴシック"/>
+                <w:b/>
+                <w:color w:val="FFFFFF"/>
+                <w:sz w:val="21"/>
+              </w:rPr>
+              <w:t>編集</w:t>
+            </w:r>
+          </w:p>
+        </w:tc>
+      </w:tr>
+      <w:tr>
+        <w:tc>
+          <w:tcPr>
+            <w:tcW w:type="dxa" w:w="3324"/>
+          </w:tcPr>
+          <w:p>
+            <w:r>
+              <w:rPr>
+                <w:rFonts w:ascii="游ゴシック" w:hAnsi="游ゴシック" w:eastAsia="游ゴシック"/>
+                <w:sz w:val="20"/>
+              </w:rPr>
+              <w:t>PC + Claude Code</w:t>
+            </w:r>
+          </w:p>
+        </w:tc>
+        <w:tc>
+          <w:tcPr>
+            <w:tcW w:type="dxa" w:w="3324"/>
+          </w:tcPr>
+          <w:p>
+            <w:r>
+              <w:rPr>
+                <w:rFonts w:ascii="游ゴシック" w:hAnsi="游ゴシック" w:eastAsia="游ゴシック"/>
+                <w:sz w:val="20"/>
+              </w:rPr>
+              <w:t>○</w:t>
+            </w:r>
+          </w:p>
+        </w:tc>
+        <w:tc>
+          <w:tcPr>
+            <w:tcW w:type="dxa" w:w="3324"/>
+          </w:tcPr>
+          <w:p>
+            <w:r>
+              <w:rPr>
+                <w:rFonts w:ascii="游ゴシック" w:hAnsi="游ゴシック" w:eastAsia="游ゴシック"/>
+                <w:sz w:val="20"/>
+              </w:rPr>
+              <w:t>○ ファイル直接編集可</w:t>
+            </w:r>
+          </w:p>
+        </w:tc>
+      </w:tr>
+      <w:tr>
+        <w:tc>
+          <w:tcPr>
+            <w:tcW w:type="dxa" w:w="3324"/>
+          </w:tcPr>
+          <w:p>
+            <w:r>
+              <w:rPr>
+                <w:rFonts w:ascii="游ゴシック" w:hAnsi="游ゴシック" w:eastAsia="游ゴシック"/>
+                <w:sz w:val="20"/>
+              </w:rPr>
+              <w:t>スマホ + claude.ai</w:t>
+            </w:r>
+          </w:p>
+        </w:tc>
+        <w:tc>
+          <w:tcPr>
+            <w:tcW w:type="dxa" w:w="3324"/>
+          </w:tcPr>
+          <w:p>
+            <w:r>
+              <w:rPr>
+                <w:rFonts w:ascii="游ゴシック" w:hAnsi="游ゴシック" w:eastAsia="游ゴシック"/>
+                <w:sz w:val="20"/>
+              </w:rPr>
+              <w:t>○</w:t>
+            </w:r>
+          </w:p>
+        </w:tc>
+        <w:tc>
+          <w:tcPr>
+            <w:tcW w:type="dxa" w:w="3324"/>
+          </w:tcPr>
+          <w:p>
+            <w:r>
+              <w:rPr>
+                <w:rFonts w:ascii="游ゴシック" w:hAnsi="游ゴシック" w:eastAsia="游ゴシック"/>
+                <w:sz w:val="20"/>
+              </w:rPr>
+              <w:t>△ チャットで生成→GitHub Web手動編集が必要</w:t>
+            </w:r>
+          </w:p>
+        </w:tc>
+      </w:tr>
+      <w:tr>
+        <w:tc>
+          <w:tcPr>
+            <w:tcW w:type="dxa" w:w="3324"/>
+          </w:tcPr>
+          <w:p>
+            <w:r>
+              <w:rPr>
+                <w:rFonts w:ascii="游ゴシック" w:hAnsi="游ゴシック" w:eastAsia="游ゴシック"/>
+                <w:sz w:val="20"/>
+              </w:rPr>
+              <w:t>スマホ + ブラウザのみ</w:t>
+            </w:r>
+          </w:p>
+        </w:tc>
+        <w:tc>
+          <w:tcPr>
+            <w:tcW w:type="dxa" w:w="3324"/>
+          </w:tcPr>
+          <w:p>
+            <w:r>
+              <w:rPr>
+                <w:rFonts w:ascii="游ゴシック" w:hAnsi="游ゴシック" w:eastAsia="游ゴシック"/>
+                <w:sz w:val="20"/>
+              </w:rPr>
+              <w:t>○ アプリ風に閲覧</w:t>
+            </w:r>
+          </w:p>
+        </w:tc>
+        <w:tc>
+          <w:tcPr>
+            <w:tcW w:type="dxa" w:w="3324"/>
+          </w:tcPr>
+          <w:p>
+            <w:r>
+              <w:rPr>
+                <w:rFonts w:ascii="游ゴシック" w:hAnsi="游ゴシック" w:eastAsia="游ゴシック"/>
+                <w:sz w:val="20"/>
+              </w:rPr>
+              <w:t>× 不可</w:t>
+            </w:r>
+          </w:p>
+        </w:tc>
+      </w:tr>
+    </w:tbl>
+    <w:p/>
+    <w:tbl>
+      <w:tblPr>
+        <w:tblW w:type="auto" w:w="0"/>
+        <w:tblLayout w:type="autofit"/>
+        <w:tblLook w:firstColumn="1" w:firstRow="1" w:lastColumn="0" w:lastRow="0" w:noHBand="0" w:noVBand="1" w:val="04A0"/>
+      </w:tblPr>
+      <w:tblGrid>
+        <w:gridCol w:w="9972"/>
+      </w:tblGrid>
+      <w:tr>
+        <w:tc>
+          <w:tcPr>
+            <w:tcW w:type="dxa" w:w="9972"/>
+            <w:shd w:val="clear" w:color="auto" w:fill="FFF8E1"/>
+            <w:tcBorders>
+              <w:top w:val="single" w:sz="8" w:color="F59E0B"/>
+              <w:left w:val="single" w:sz="8" w:color="F59E0B"/>
+              <w:bottom w:val="single" w:sz="8" w:color="F59E0B"/>
+              <w:right w:val="single" w:sz="8" w:color="F59E0B"/>
+            </w:tcBorders>
+          </w:tcPr>
+          <w:p>
+            <w:r>
+              <w:rPr>
+                <w:rFonts w:ascii="游ゴシック" w:hAnsi="游ゴシック" w:eastAsia="游ゴシック"/>
+                <w:sz w:val="20"/>
+              </w:rPr>
+              <w:t>📱 スマホで更新したい場合：claude.ai でニュース取得 → GitHub.com で index.html を手動編集 → コミット → Netlify自動デプロイ。ただし所要時間10～15分とPC運用より大変なので、PC運用がおすすめです。</w:t>
+            </w:r>
+          </w:p>
+        </w:tc>
+      </w:tr>
+    </w:tbl>
+    <w:p/>
+    <w:p>
+      <w:pPr>
         <w:spacing w:before="360" w:after="160"/>
         <w:pBdr>
           <w:bottom w:val="single" w:sz="12" w:space="4" w:color="1E3A8A"/>
@@ -1444,7 +2481,7 @@
           <w:color w:val="333333"/>
           <w:sz w:val="27"/>
         </w:rPr>
-        <w:t>6-1. 毎朝の流れ</w:t>
+        <w:t>6-1. 毎朝の流れ（C案：ワンクリック公開）</w:t>
       </w:r>
     </w:p>
     <w:p>
@@ -1457,7 +2494,7 @@
           <w:rFonts w:ascii="游ゴシック" w:hAnsi="游ゴシック" w:eastAsia="游ゴシック"/>
           <w:sz w:val="21"/>
         </w:rPr>
-        <w:t>7:00 Claudeに「定例報告」と依頼</w:t>
+        <w:t>Claude Code を開く</w:t>
       </w:r>
     </w:p>
     <w:p>
@@ -1470,7 +2507,7 @@
           <w:rFonts w:ascii="游ゴシック" w:hAnsi="游ゴシック" w:eastAsia="游ゴシック"/>
           <w:sz w:val="21"/>
         </w:rPr>
-        <w:t>Claudeが最新の経済ニュース5件＋税制改正情報を生成</w:t>
+        <w:t>「定例報告」と入力 → Enter</w:t>
       </w:r>
     </w:p>
     <w:p>
@@ -1483,7 +2520,7 @@
           <w:rFonts w:ascii="游ゴシック" w:hAnsi="游ゴシック" w:eastAsia="游ゴシック"/>
           <w:sz w:val="21"/>
         </w:rPr>
-        <w:t>内容を確認し、index.html に反映してもらう</w:t>
+        <w:t>Claudeが最新の経済ニュース5件＋株価影響コメントを生成</w:t>
       </w:r>
     </w:p>
     <w:p>
@@ -1496,7 +2533,7 @@
           <w:rFonts w:ascii="游ゴシック" w:hAnsi="游ゴシック" w:eastAsia="游ゴシック"/>
           <w:sz w:val="21"/>
         </w:rPr>
-        <w:t>「公開用を更新.bat」を実行→Netlifyにドラッグ＆ドロップ</w:t>
+        <w:t>Claudeが index.html を直接更新（日付・ニュース内容）</w:t>
       </w:r>
     </w:p>
     <w:p>
@@ -1509,9 +2546,56 @@
           <w:rFonts w:ascii="游ゴシック" w:hAnsi="游ゴシック" w:eastAsia="游ゴシック"/>
           <w:sz w:val="21"/>
         </w:rPr>
-        <w:t>全員に最新情報が共有される</w:t>
+        <w:t>「GitHubに更新.bat」をダブルクリック</w:t>
       </w:r>
     </w:p>
+    <w:p>
+      <w:pPr>
+        <w:pStyle w:val="ListNumber"/>
+        <w:spacing w:after="40"/>
+      </w:pPr>
+      <w:r>
+        <w:rPr>
+          <w:rFonts w:ascii="游ゴシック" w:hAnsi="游ゴシック" w:eastAsia="游ゴシック"/>
+          <w:sz w:val="21"/>
+        </w:rPr>
+        <w:t>「Push成功!」が表示されれば完了 — 30秒以内に公開URLに反映</w:t>
+      </w:r>
+    </w:p>
+    <w:tbl>
+      <w:tblPr>
+        <w:tblW w:type="auto" w:w="0"/>
+        <w:tblLayout w:type="autofit"/>
+        <w:tblLook w:firstColumn="1" w:firstRow="1" w:lastColumn="0" w:lastRow="0" w:noHBand="0" w:noVBand="1" w:val="04A0"/>
+      </w:tblPr>
+      <w:tblGrid>
+        <w:gridCol w:w="9972"/>
+      </w:tblGrid>
+      <w:tr>
+        <w:tc>
+          <w:tcPr>
+            <w:tcW w:type="dxa" w:w="9972"/>
+            <w:shd w:val="clear" w:color="auto" w:fill="FFF8E1"/>
+            <w:tcBorders>
+              <w:top w:val="single" w:sz="8" w:color="F59E0B"/>
+              <w:left w:val="single" w:sz="8" w:color="F59E0B"/>
+              <w:bottom w:val="single" w:sz="8" w:color="F59E0B"/>
+              <w:right w:val="single" w:sz="8" w:color="F59E0B"/>
+            </w:tcBorders>
+          </w:tcPr>
+          <w:p>
+            <w:r>
+              <w:rPr>
+                <w:rFonts w:ascii="游ゴシック" w:hAnsi="游ゴシック" w:eastAsia="游ゴシック"/>
+                <w:sz w:val="20"/>
+              </w:rPr>
+              <w:t>所要時間：1～2分。スマホ・他人もURLでアクセスすれば最新版を閲覧できます。</w:t>
+            </w:r>
+          </w:p>
+        </w:tc>
+      </w:tr>
+    </w:tbl>
+    <w:p/>
     <w:p>
       <w:pPr>
         <w:spacing w:before="240" w:after="80"/>
@@ -1562,7 +2646,7 @@
           <w:rFonts w:ascii="游ゴシック" w:hAnsi="游ゴシック" w:eastAsia="游ゴシック"/>
           <w:sz w:val="21"/>
         </w:rPr>
-        <w:t>更新後、「公開用を更新.bat」→Netlify公開</w:t>
+        <w:t>更新後、「GitHubに更新.bat」をダブルクリックでpush公開</w:t>
       </w:r>
     </w:p>
     <w:p>
@@ -2490,7 +3574,442 @@
           <w:color w:val="1E3A8A"/>
           <w:sz w:val="36"/>
         </w:rPr>
-        <w:t>7. トラブルシューティング</w:t>
+        <w:t>7. 自動化オプション（毎朝7時の自動起動）</w:t>
+      </w:r>
+    </w:p>
+    <w:p>
+      <w:pPr>
+        <w:spacing w:after="80"/>
+      </w:pPr>
+      <w:r>
+        <w:rPr>
+          <w:rFonts w:ascii="游ゴシック" w:hAnsi="游ゴシック" w:eastAsia="游ゴシック"/>
+          <w:b w:val="0"/>
+          <w:sz w:val="21"/>
+        </w:rPr>
+        <w:t>通常はC案（ワンクリック公開）で十分ですが、毎朝7時に自動的に作業を始めたい場合は以下の方法があります。</w:t>
+      </w:r>
+    </w:p>
+    <w:p>
+      <w:pPr>
+        <w:spacing w:before="240" w:after="80"/>
+      </w:pPr>
+      <w:r>
+        <w:rPr>
+          <w:rFonts w:ascii="游ゴシック" w:hAnsi="游ゴシック" w:eastAsia="游ゴシック"/>
+          <w:b/>
+          <w:color w:val="333333"/>
+          <w:sz w:val="27"/>
+        </w:rPr>
+        <w:t>7-1. B案：Windows タスクスケジューラ（PC起動中の自動化）</w:t>
+      </w:r>
+    </w:p>
+    <w:p>
+      <w:pPr>
+        <w:spacing w:after="80"/>
+      </w:pPr>
+      <w:r>
+        <w:rPr>
+          <w:rFonts w:ascii="游ゴシック" w:hAnsi="游ゴシック" w:eastAsia="游ゴシック"/>
+          <w:b w:val="0"/>
+          <w:sz w:val="21"/>
+        </w:rPr>
+        <w:t>Windows標準機能のタスクスケジューラを使って、毎朝7時に「朝の自動更新.bat」を起動させます。PC が起動中である必要があります。</w:t>
+      </w:r>
+    </w:p>
+    <w:p>
+      <w:pPr>
+        <w:spacing w:before="160" w:after="40"/>
+      </w:pPr>
+      <w:r>
+        <w:rPr>
+          <w:rFonts w:ascii="游ゴシック" w:hAnsi="游ゴシック" w:eastAsia="游ゴシック"/>
+          <w:b/>
+          <w:color w:val="1E3A8A"/>
+          <w:sz w:val="23"/>
+        </w:rPr>
+        <w:t>■ 初回セットアップ（1回だけ）</w:t>
+      </w:r>
+    </w:p>
+    <w:p>
+      <w:pPr>
+        <w:pStyle w:val="ListNumber"/>
+        <w:spacing w:after="40"/>
+      </w:pPr>
+      <w:r>
+        <w:rPr>
+          <w:rFonts w:ascii="游ゴシック" w:hAnsi="游ゴシック" w:eastAsia="游ゴシック"/>
+          <w:sz w:val="21"/>
+        </w:rPr>
+        <w:t>「タスクスケジューラ_設定.bat」をダブルクリック</w:t>
+      </w:r>
+    </w:p>
+    <w:p>
+      <w:pPr>
+        <w:pStyle w:val="ListNumber"/>
+        <w:spacing w:after="40"/>
+      </w:pPr>
+      <w:r>
+        <w:rPr>
+          <w:rFonts w:ascii="游ゴシック" w:hAnsi="游ゴシック" w:eastAsia="游ゴシック"/>
+          <w:sz w:val="21"/>
+        </w:rPr>
+        <w:t>確認メッセージで「Y」を押す</w:t>
+      </w:r>
+    </w:p>
+    <w:p>
+      <w:pPr>
+        <w:pStyle w:val="ListNumber"/>
+        <w:spacing w:after="40"/>
+      </w:pPr>
+      <w:r>
+        <w:rPr>
+          <w:rFonts w:ascii="游ゴシック" w:hAnsi="游ゴシック" w:eastAsia="游ゴシック"/>
+          <w:sz w:val="21"/>
+        </w:rPr>
+        <w:t>「設定完了!」と表示されれば設定完了</w:t>
+      </w:r>
+    </w:p>
+    <w:p>
+      <w:pPr>
+        <w:pStyle w:val="ListNumber"/>
+        <w:spacing w:after="40"/>
+      </w:pPr>
+      <w:r>
+        <w:rPr>
+          <w:rFonts w:ascii="游ゴシック" w:hAnsi="游ゴシック" w:eastAsia="游ゴシック"/>
+          <w:sz w:val="21"/>
+        </w:rPr>
+        <w:t>Windowsのタスクスケジューラに「定例報告_朝の自動起動」が登録される</w:t>
+      </w:r>
+    </w:p>
+    <w:p>
+      <w:pPr>
+        <w:spacing w:before="160" w:after="40"/>
+      </w:pPr>
+      <w:r>
+        <w:rPr>
+          <w:rFonts w:ascii="游ゴシック" w:hAnsi="游ゴシック" w:eastAsia="游ゴシック"/>
+          <w:b/>
+          <w:color w:val="1E3A8A"/>
+          <w:sz w:val="23"/>
+        </w:rPr>
+        <w:t>■ 毎朝7時の動作</w:t>
+      </w:r>
+    </w:p>
+    <w:p>
+      <w:pPr>
+        <w:pStyle w:val="ListNumber"/>
+        <w:spacing w:after="40"/>
+      </w:pPr>
+      <w:r>
+        <w:rPr>
+          <w:rFonts w:ascii="游ゴシック" w:hAnsi="游ゴシック" w:eastAsia="游ゴシック"/>
+          <w:sz w:val="21"/>
+        </w:rPr>
+        <w:t>「朝の自動更新.bat」が自動起動</w:t>
+      </w:r>
+    </w:p>
+    <w:p>
+      <w:pPr>
+        <w:pStyle w:val="ListNumber"/>
+        <w:spacing w:after="40"/>
+      </w:pPr>
+      <w:r>
+        <w:rPr>
+          <w:rFonts w:ascii="游ゴシック" w:hAnsi="游ゴシック" w:eastAsia="游ゴシック"/>
+          <w:sz w:val="21"/>
+        </w:rPr>
+        <w:t>デスクトップに通知が表示される</w:t>
+      </w:r>
+    </w:p>
+    <w:p>
+      <w:pPr>
+        <w:pStyle w:val="ListNumber"/>
+        <w:spacing w:after="40"/>
+      </w:pPr>
+      <w:r>
+        <w:rPr>
+          <w:rFonts w:ascii="游ゴシック" w:hAnsi="游ゴシック" w:eastAsia="游ゴシック"/>
+          <w:sz w:val="21"/>
+        </w:rPr>
+        <w:t>Claude Code が自動起動（ブラウザ版の場合あり）</w:t>
+      </w:r>
+    </w:p>
+    <w:p>
+      <w:pPr>
+        <w:pStyle w:val="ListNumber"/>
+        <w:spacing w:after="40"/>
+      </w:pPr>
+      <w:r>
+        <w:rPr>
+          <w:rFonts w:ascii="游ゴシック" w:hAnsi="游ゴシック" w:eastAsia="游ゴシック"/>
+          <w:sz w:val="21"/>
+        </w:rPr>
+        <w:t>ユーザーが「定例報告」と入力 → HTML 更新</w:t>
+      </w:r>
+    </w:p>
+    <w:p>
+      <w:pPr>
+        <w:pStyle w:val="ListNumber"/>
+        <w:spacing w:after="40"/>
+      </w:pPr>
+      <w:r>
+        <w:rPr>
+          <w:rFonts w:ascii="游ゴシック" w:hAnsi="游ゴシック" w:eastAsia="游ゴシック"/>
+          <w:sz w:val="21"/>
+        </w:rPr>
+        <w:t>黒い画面で Enter キーを押す</w:t>
+      </w:r>
+    </w:p>
+    <w:p>
+      <w:pPr>
+        <w:pStyle w:val="ListNumber"/>
+        <w:spacing w:after="40"/>
+      </w:pPr>
+      <w:r>
+        <w:rPr>
+          <w:rFonts w:ascii="游ゴシック" w:hAnsi="游ゴシック" w:eastAsia="游ゴシック"/>
+          <w:sz w:val="21"/>
+        </w:rPr>
+        <w:t>自動で git push → Netlify公開</w:t>
+      </w:r>
+    </w:p>
+    <w:p>
+      <w:pPr>
+        <w:spacing w:before="160" w:after="40"/>
+      </w:pPr>
+      <w:r>
+        <w:rPr>
+          <w:rFonts w:ascii="游ゴシック" w:hAnsi="游ゴシック" w:eastAsia="游ゴシック"/>
+          <w:b/>
+          <w:color w:val="1E3A8A"/>
+          <w:sz w:val="23"/>
+        </w:rPr>
+        <w:t>■ 解除したい場合</w:t>
+      </w:r>
+    </w:p>
+    <w:p>
+      <w:pPr>
+        <w:pStyle w:val="ListBullet"/>
+        <w:spacing w:after="40"/>
+      </w:pPr>
+      <w:r>
+        <w:rPr>
+          <w:rFonts w:ascii="游ゴシック" w:hAnsi="游ゴシック" w:eastAsia="游ゴシック"/>
+          <w:sz w:val="21"/>
+        </w:rPr>
+        <w:t>「タスクスケジューラ_解除.bat」を実行</w:t>
+      </w:r>
+    </w:p>
+    <w:p>
+      <w:pPr>
+        <w:pStyle w:val="ListBullet"/>
+        <w:spacing w:after="40"/>
+      </w:pPr>
+      <w:r>
+        <w:rPr>
+          <w:rFonts w:ascii="游ゴシック" w:hAnsi="游ゴシック" w:eastAsia="游ゴシック"/>
+          <w:sz w:val="21"/>
+        </w:rPr>
+        <w:t>確認メッセージで「Y」を押すと解除される</w:t>
+      </w:r>
+    </w:p>
+    <w:tbl>
+      <w:tblPr>
+        <w:tblW w:type="auto" w:w="0"/>
+        <w:tblLayout w:type="autofit"/>
+        <w:tblLook w:firstColumn="1" w:firstRow="1" w:lastColumn="0" w:lastRow="0" w:noHBand="0" w:noVBand="1" w:val="04A0"/>
+      </w:tblPr>
+      <w:tblGrid>
+        <w:gridCol w:w="9972"/>
+      </w:tblGrid>
+      <w:tr>
+        <w:tc>
+          <w:tcPr>
+            <w:tcW w:type="dxa" w:w="9972"/>
+            <w:shd w:val="clear" w:color="auto" w:fill="FFF8E1"/>
+            <w:tcBorders>
+              <w:top w:val="single" w:sz="8" w:color="F59E0B"/>
+              <w:left w:val="single" w:sz="8" w:color="F59E0B"/>
+              <w:bottom w:val="single" w:sz="8" w:color="F59E0B"/>
+              <w:right w:val="single" w:sz="8" w:color="F59E0B"/>
+            </w:tcBorders>
+          </w:tcPr>
+          <w:p>
+            <w:r>
+              <w:rPr>
+                <w:rFonts w:ascii="游ゴシック" w:hAnsi="游ゴシック" w:eastAsia="游ゴシック"/>
+                <w:sz w:val="20"/>
+              </w:rPr>
+              <w:t>⚠️ 注意：B案はPCが起動している必要があります。スリープ・シャットダウンしているとタスクは動きません。確実に動かしたい場合は7時前にPC起動の習慣化を。</w:t>
+            </w:r>
+          </w:p>
+        </w:tc>
+      </w:tr>
+    </w:tbl>
+    <w:p/>
+    <w:p>
+      <w:pPr>
+        <w:spacing w:before="240" w:after="80"/>
+      </w:pPr>
+      <w:r>
+        <w:rPr>
+          <w:rFonts w:ascii="游ゴシック" w:hAnsi="游ゴシック" w:eastAsia="游ゴシック"/>
+          <w:b/>
+          <w:color w:val="333333"/>
+          <w:sz w:val="27"/>
+        </w:rPr>
+        <w:t>7-2. 将来：Claude Code /schedule（クラウド自動化）</w:t>
+      </w:r>
+    </w:p>
+    <w:p>
+      <w:pPr>
+        <w:spacing w:after="80"/>
+      </w:pPr>
+      <w:r>
+        <w:rPr>
+          <w:rFonts w:ascii="游ゴシック" w:hAnsi="游ゴシック" w:eastAsia="游ゴシック"/>
+          <w:b w:val="0"/>
+          <w:sz w:val="21"/>
+        </w:rPr>
+        <w:t>Claude Pro プランの /schedule 機能を使うと、クラウド側で自動実行されるため、PC起動不要で完全自動化が可能です（現在は接続不可で待機中）。</w:t>
+      </w:r>
+    </w:p>
+    <w:p>
+      <w:pPr>
+        <w:spacing w:before="160" w:after="40"/>
+      </w:pPr>
+      <w:r>
+        <w:rPr>
+          <w:rFonts w:ascii="游ゴシック" w:hAnsi="游ゴシック" w:eastAsia="游ゴシック"/>
+          <w:b/>
+          <w:color w:val="1E3A8A"/>
+          <w:sz w:val="23"/>
+        </w:rPr>
+        <w:t>■ /schedule が使えるようになったら</w:t>
+      </w:r>
+    </w:p>
+    <w:p>
+      <w:pPr>
+        <w:pStyle w:val="ListNumber"/>
+        <w:spacing w:after="40"/>
+      </w:pPr>
+      <w:r>
+        <w:rPr>
+          <w:rFonts w:ascii="游ゴシック" w:hAnsi="游ゴシック" w:eastAsia="游ゴシック"/>
+          <w:sz w:val="21"/>
+        </w:rPr>
+        <w:t>「タスクスケジューラ_解除.bat」で B案を解除</w:t>
+      </w:r>
+    </w:p>
+    <w:p>
+      <w:pPr>
+        <w:pStyle w:val="ListNumber"/>
+        <w:spacing w:after="40"/>
+      </w:pPr>
+      <w:r>
+        <w:rPr>
+          <w:rFonts w:ascii="游ゴシック" w:hAnsi="游ゴシック" w:eastAsia="游ゴシック"/>
+          <w:sz w:val="21"/>
+        </w:rPr>
+        <w:t>Claude Code で「/schedule」を実行</w:t>
+      </w:r>
+    </w:p>
+    <w:p>
+      <w:pPr>
+        <w:pStyle w:val="ListNumber"/>
+        <w:spacing w:after="40"/>
+      </w:pPr>
+      <w:r>
+        <w:rPr>
+          <w:rFonts w:ascii="游ゴシック" w:hAnsi="游ゴシック" w:eastAsia="游ゴシック"/>
+          <w:sz w:val="21"/>
+        </w:rPr>
+        <w:t>「_自動更新の指示プロンプト.md」の内容を /schedule に登録</w:t>
+      </w:r>
+    </w:p>
+    <w:p>
+      <w:pPr>
+        <w:pStyle w:val="ListNumber"/>
+        <w:spacing w:after="40"/>
+      </w:pPr>
+      <w:r>
+        <w:rPr>
+          <w:rFonts w:ascii="游ゴシック" w:hAnsi="游ゴシック" w:eastAsia="游ゴシック"/>
+          <w:sz w:val="21"/>
+        </w:rPr>
+        <w:t>毎朝7時にクラウド側で自動実行</w:t>
+      </w:r>
+    </w:p>
+    <w:p>
+      <w:pPr>
+        <w:pStyle w:val="ListNumber"/>
+        <w:spacing w:after="40"/>
+      </w:pPr>
+      <w:r>
+        <w:rPr>
+          <w:rFonts w:ascii="游ゴシック" w:hAnsi="游ゴシック" w:eastAsia="游ゴシック"/>
+          <w:sz w:val="21"/>
+        </w:rPr>
+        <w:t>PC が起動していなくても更新される</w:t>
+      </w:r>
+    </w:p>
+    <w:p>
+      <w:pPr>
+        <w:spacing w:before="160" w:after="40"/>
+      </w:pPr>
+      <w:r>
+        <w:rPr>
+          <w:rFonts w:ascii="游ゴシック" w:hAnsi="游ゴシック" w:eastAsia="游ゴシック"/>
+          <w:b/>
+          <w:color w:val="1E3A8A"/>
+          <w:sz w:val="23"/>
+        </w:rPr>
+        <w:t>■ /schedule に渡すプロンプトの保管場所</w:t>
+      </w:r>
+    </w:p>
+    <w:p>
+      <w:pPr>
+        <w:pStyle w:val="ListBullet"/>
+        <w:spacing w:after="40"/>
+      </w:pPr>
+      <w:r>
+        <w:rPr>
+          <w:rFonts w:ascii="游ゴシック" w:hAnsi="游ゴシック" w:eastAsia="游ゴシック"/>
+          <w:sz w:val="21"/>
+        </w:rPr>
+        <w:t>「_自動更新の指示プロンプト.md」に詳細を記載済み</w:t>
+      </w:r>
+    </w:p>
+    <w:p>
+      <w:pPr>
+        <w:pStyle w:val="ListBullet"/>
+        <w:spacing w:after="40"/>
+      </w:pPr>
+      <w:r>
+        <w:rPr>
+          <w:rFonts w:ascii="游ゴシック" w:hAnsi="游ゴシック" w:eastAsia="游ゴシック"/>
+          <w:sz w:val="21"/>
+        </w:rPr>
+        <w:t>Claudeへの依頼内容、git push 手順まで網羅</w:t>
+      </w:r>
+    </w:p>
+    <w:p>
+      <w:pPr>
+        <w:spacing w:before="360" w:after="160"/>
+        <w:pBdr>
+          <w:bottom w:val="single" w:sz="12" w:space="4" w:color="1E3A8A"/>
+        </w:pBdr>
+      </w:pPr>
+      <w:r>
+        <w:rPr>
+          <w:rFonts w:ascii="游ゴシック" w:hAnsi="游ゴシック" w:eastAsia="游ゴシック"/>
+          <w:b/>
+          <w:color w:val="1E3A8A"/>
+          <w:sz w:val="36"/>
+        </w:rPr>
+        <w:t>8. トラブルシューティング</w:t>
       </w:r>
     </w:p>
     <w:tbl>
@@ -2640,7 +4159,7 @@
                 <w:rFonts w:ascii="游ゴシック" w:hAnsi="游ゴシック" w:eastAsia="游ゴシック"/>
                 <w:sz w:val="20"/>
               </w:rPr>
-              <w:t>Netlifyで更新が反映されない</w:t>
+              <w:t>GitHubに更新.batでpush失敗</w:t>
             </w:r>
           </w:p>
         </w:tc>
@@ -2654,7 +4173,67 @@
                 <w:rFonts w:ascii="游ゴシック" w:hAnsi="游ゴシック" w:eastAsia="游ゴシック"/>
                 <w:sz w:val="20"/>
               </w:rPr>
-              <w:t>ブラウザのキャッシュをクリア（Ctrl+Shift+R）。sw.jsのバージョンを上げる手も有効。</w:t>
+              <w:t>ネット接続を確認。git の認証が切れた場合はブラウザでGitHub再ログイン。</w:t>
+            </w:r>
+          </w:p>
+        </w:tc>
+      </w:tr>
+      <w:tr>
+        <w:tc>
+          <w:tcPr>
+            <w:tcW w:type="dxa" w:w="4986"/>
+          </w:tcPr>
+          <w:p>
+            <w:r>
+              <w:rPr>
+                <w:rFonts w:ascii="游ゴシック" w:hAnsi="游ゴシック" w:eastAsia="游ゴシック"/>
+                <w:sz w:val="20"/>
+              </w:rPr>
+              <w:t>Netlifyに公開が反映されない</w:t>
+            </w:r>
+          </w:p>
+        </w:tc>
+        <w:tc>
+          <w:tcPr>
+            <w:tcW w:type="dxa" w:w="4986"/>
+          </w:tcPr>
+          <w:p>
+            <w:r>
+              <w:rPr>
+                <w:rFonts w:ascii="游ゴシック" w:hAnsi="游ゴシック" w:eastAsia="游ゴシック"/>
+                <w:sz w:val="20"/>
+              </w:rPr>
+              <w:t>GitHubリポジトリでcommitが届いているか確認。Netlifyダッシュボードの「Deploys」タブでビルド状況を確認。</w:t>
+            </w:r>
+          </w:p>
+        </w:tc>
+      </w:tr>
+      <w:tr>
+        <w:tc>
+          <w:tcPr>
+            <w:tcW w:type="dxa" w:w="4986"/>
+          </w:tcPr>
+          <w:p>
+            <w:r>
+              <w:rPr>
+                <w:rFonts w:ascii="游ゴシック" w:hAnsi="游ゴシック" w:eastAsia="游ゴシック"/>
+                <w:sz w:val="20"/>
+              </w:rPr>
+              <w:t>Netlifyビルドが失敗</w:t>
+            </w:r>
+          </w:p>
+        </w:tc>
+        <w:tc>
+          <w:tcPr>
+            <w:tcW w:type="dxa" w:w="4986"/>
+          </w:tcPr>
+          <w:p>
+            <w:r>
+              <w:rPr>
+                <w:rFonts w:ascii="游ゴシック" w:hAnsi="游ゴシック" w:eastAsia="游ゴシック"/>
+                <w:sz w:val="20"/>
+              </w:rPr>
+              <w:t>Netlifyの「Deploy log」でエラー内容を確認。基本的に静的HTMLなので失敗しないはず。</w:t>
             </w:r>
           </w:p>
         </w:tc>
@@ -2684,7 +4263,7 @@
                 <w:rFonts w:ascii="游ゴシック" w:hAnsi="游ゴシック" w:eastAsia="游ゴシック"/>
                 <w:sz w:val="20"/>
               </w:rPr>
-              <w:t>Service Worker のキャッシュ。sw.jsのCACHE名を v2→v3 などに変更してデプロイ。</w:t>
+              <w:t>Service Worker のキャッシュ。sw.jsのCACHE名を v5→v6 などに変更してデプロイ。</w:t>
             </w:r>
           </w:p>
         </w:tc>
@@ -2820,6 +4399,66 @@
                 <w:rFonts w:ascii="游ゴシック" w:hAnsi="游ゴシック" w:eastAsia="游ゴシック"/>
                 <w:sz w:val="20"/>
               </w:rPr>
+              <w:t>タスクスケジューラが動かない</w:t>
+            </w:r>
+          </w:p>
+        </w:tc>
+        <w:tc>
+          <w:tcPr>
+            <w:tcW w:type="dxa" w:w="4986"/>
+          </w:tcPr>
+          <w:p>
+            <w:r>
+              <w:rPr>
+                <w:rFonts w:ascii="游ゴシック" w:hAnsi="游ゴシック" w:eastAsia="游ゴシック"/>
+                <w:sz w:val="20"/>
+              </w:rPr>
+              <w:t>PC が起動していない/スリープしている可能性。タスクスケジューラのアプリで実行履歴を確認。</w:t>
+            </w:r>
+          </w:p>
+        </w:tc>
+      </w:tr>
+      <w:tr>
+        <w:tc>
+          <w:tcPr>
+            <w:tcW w:type="dxa" w:w="4986"/>
+          </w:tcPr>
+          <w:p>
+            <w:r>
+              <w:rPr>
+                <w:rFonts w:ascii="游ゴシック" w:hAnsi="游ゴシック" w:eastAsia="游ゴシック"/>
+                <w:sz w:val="20"/>
+              </w:rPr>
+              <w:t>/schedule が「接続できない」と表示</w:t>
+            </w:r>
+          </w:p>
+        </w:tc>
+        <w:tc>
+          <w:tcPr>
+            <w:tcW w:type="dxa" w:w="4986"/>
+          </w:tcPr>
+          <w:p>
+            <w:r>
+              <w:rPr>
+                <w:rFonts w:ascii="游ゴシック" w:hAnsi="游ゴシック" w:eastAsia="游ゴシック"/>
+                <w:sz w:val="20"/>
+              </w:rPr>
+              <w:t>Anthropic側の一時的なメンテナンスまたはアカウント側の機能制限。後日再試行。</w:t>
+            </w:r>
+          </w:p>
+        </w:tc>
+      </w:tr>
+      <w:tr>
+        <w:tc>
+          <w:tcPr>
+            <w:tcW w:type="dxa" w:w="4986"/>
+          </w:tcPr>
+          <w:p>
+            <w:r>
+              <w:rPr>
+                <w:rFonts w:ascii="游ゴシック" w:hAnsi="游ゴシック" w:eastAsia="游ゴシック"/>
+                <w:sz w:val="20"/>
+              </w:rPr>
               <w:t>手順書を作り直したい</w:t>
             </w:r>
           </w:p>
@@ -2855,7 +4494,7 @@
           <w:color w:val="1E3A8A"/>
           <w:sz w:val="36"/>
         </w:rPr>
-        <w:t>8. 手順書の再生成</w:t>
+        <w:t>9. 手順書の再生成</w:t>
       </w:r>
     </w:p>
     <w:p>

</xml_diff>

<commit_message>
Update manual: migrate from Netlify to GitHub Pages
</commit_message>
<xml_diff>
--- a/定例報告_運用手順書.docx
+++ b/定例報告_運用手順書.docx
@@ -56,7 +56,7 @@
           <w:color w:val="999999"/>
           <w:sz w:val="22"/>
         </w:rPr>
-        <w:t>作成日：2026年6月2日</w:t>
+        <w:t>作成日：2026年6月2日　／　最終更新：2026年6月5日（GitHub Pages移行）</w:t>
       </w:r>
     </w:p>
     <w:p>
@@ -236,7 +236,7 @@
           <w:rFonts w:ascii="游ゴシック" w:hAnsi="游ゴシック" w:eastAsia="游ゴシック"/>
           <w:sz w:val="21"/>
         </w:rPr>
-        <w:t>Web公開：GitHub + Netlify 自動デプロイ（push したら数十秒で公開）</w:t>
+        <w:t>Web公開：GitHub Pages 自動デプロイ（push したら約1分で公開、完全無料・クレジット制限なし）</w:t>
       </w:r>
     </w:p>
     <w:p>
@@ -276,7 +276,7 @@
           <w:color w:val="1E3A8A"/>
           <w:sz w:val="23"/>
         </w:rPr>
-        <w:t>■ 公開URL</w:t>
+        <w:t>■ 公開URL（現行：GitHub Pages）</w:t>
       </w:r>
     </w:p>
     <w:p>
@@ -289,7 +289,49 @@
           <w:b w:val="0"/>
           <w:sz w:val="21"/>
         </w:rPr>
-        <w:t>https://teirei-houkoku.netlify.app</w:t>
+        <w:t>https://abe2300.github.io/ebachan/</w:t>
+      </w:r>
+    </w:p>
+    <w:p>
+      <w:pPr>
+        <w:spacing w:after="80"/>
+      </w:pPr>
+      <w:r>
+        <w:rPr>
+          <w:rFonts w:ascii="游ゴシック" w:hAnsi="游ゴシック" w:eastAsia="游ゴシック"/>
+          <w:b w:val="0"/>
+          <w:color w:val="999999"/>
+          <w:sz w:val="21"/>
+        </w:rPr>
+        <w:t>※ 2026年6月5日にNetlifyのクレジット切れによりGitHub Pagesへ移行しました。</w:t>
+      </w:r>
+    </w:p>
+    <w:p>
+      <w:pPr>
+        <w:spacing w:before="160" w:after="40"/>
+      </w:pPr>
+      <w:r>
+        <w:rPr>
+          <w:rFonts w:ascii="游ゴシック" w:hAnsi="游ゴシック" w:eastAsia="游ゴシック"/>
+          <w:b/>
+          <w:color w:val="1E3A8A"/>
+          <w:sz w:val="23"/>
+        </w:rPr>
+        <w:t>■ 旧公開URL（停止中・参考）</w:t>
+      </w:r>
+    </w:p>
+    <w:p>
+      <w:pPr>
+        <w:spacing w:after="80"/>
+      </w:pPr>
+      <w:r>
+        <w:rPr>
+          <w:rFonts w:ascii="游ゴシック" w:hAnsi="游ゴシック" w:eastAsia="游ゴシック"/>
+          <w:b w:val="0"/>
+          <w:color w:val="999999"/>
+          <w:sz w:val="21"/>
+        </w:rPr>
+        <w:t>https://teirei-houkoku.netlify.app  （Netlifyクレジット限度超過のため一時停止）</w:t>
       </w:r>
     </w:p>
     <w:p>
@@ -1157,7 +1199,7 @@
           <w:color w:val="1E3A8A"/>
           <w:sz w:val="36"/>
         </w:rPr>
-        <w:t>4. Web公開・共有する方法（GitHub + Netlify 自動デプロイ）</w:t>
+        <w:t>4. Web公開・共有する方法（GitHub Pages 自動デプロイ）</w:t>
       </w:r>
     </w:p>
     <w:p>
@@ -1170,7 +1212,7 @@
           <w:b w:val="0"/>
           <w:sz w:val="21"/>
         </w:rPr>
-        <w:t>GitHubとNetlifyを連携させて、git push するだけで自動的にWebサイトが更新される仕組みを構築済みです。手動でNetlifyにファイルをアップする必要はありません。</w:t>
+        <w:t>GitHub Pages を使って、git push するだけで自動的にWebサイトが更新される仕組みを構築済みです。完全無料・クレジット制限なしで、Netlifyに依存しません。</w:t>
       </w:r>
     </w:p>
     <w:p>
@@ -1391,7 +1433,7 @@
                 <w:rFonts w:ascii="游ゴシック" w:hAnsi="游ゴシック" w:eastAsia="游ゴシック"/>
                 <w:sz w:val="20"/>
               </w:rPr>
-              <w:t>Netlifyが自動検知して新ビルドをデプロイ</w:t>
+              <w:t>GitHub Pages が自動検知してビルド・配信</w:t>
             </w:r>
           </w:p>
         </w:tc>
@@ -1421,7 +1463,7 @@
                 <w:rFonts w:ascii="游ゴシック" w:hAnsi="游ゴシック" w:eastAsia="游ゴシック"/>
                 <w:sz w:val="20"/>
               </w:rPr>
-              <w:t>数秒〜30秒で https://teirei-houkoku.netlify.app に公開</w:t>
+              <w:t>約1分で https://abe2300.github.io/ebachan/ に公開</w:t>
             </w:r>
           </w:p>
         </w:tc>
@@ -1499,7 +1541,7 @@
                 <w:rFonts w:ascii="游ゴシック" w:hAnsi="游ゴシック" w:eastAsia="游ゴシック"/>
                 <w:sz w:val="20"/>
               </w:rPr>
-              <w:t>公開URL</w:t>
+              <w:t>公開URL（現行）</w:t>
             </w:r>
           </w:p>
         </w:tc>
@@ -1513,7 +1555,37 @@
                 <w:rFonts w:ascii="游ゴシック" w:hAnsi="游ゴシック" w:eastAsia="游ゴシック"/>
                 <w:sz w:val="20"/>
               </w:rPr>
-              <w:t>https://teirei-houkoku.netlify.app</w:t>
+              <w:t>https://abe2300.github.io/ebachan/</w:t>
+            </w:r>
+          </w:p>
+        </w:tc>
+      </w:tr>
+      <w:tr>
+        <w:tc>
+          <w:tcPr>
+            <w:tcW w:type="dxa" w:w="4986"/>
+          </w:tcPr>
+          <w:p>
+            <w:r>
+              <w:rPr>
+                <w:rFonts w:ascii="游ゴシック" w:hAnsi="游ゴシック" w:eastAsia="游ゴシック"/>
+                <w:sz w:val="20"/>
+              </w:rPr>
+              <w:t>公開方式</w:t>
+            </w:r>
+          </w:p>
+        </w:tc>
+        <w:tc>
+          <w:tcPr>
+            <w:tcW w:type="dxa" w:w="4986"/>
+          </w:tcPr>
+          <w:p>
+            <w:r>
+              <w:rPr>
+                <w:rFonts w:ascii="游ゴシック" w:hAnsi="游ゴシック" w:eastAsia="游ゴシック"/>
+                <w:sz w:val="20"/>
+              </w:rPr>
+              <w:t>GitHub Pages（Settings → Pages → main / root）</w:t>
             </w:r>
           </w:p>
         </w:tc>
@@ -1559,36 +1631,6 @@
                 <w:rFonts w:ascii="游ゴシック" w:hAnsi="游ゴシック" w:eastAsia="游ゴシック"/>
                 <w:sz w:val="20"/>
               </w:rPr>
-              <w:t>Netlifyプロジェクト名</w:t>
-            </w:r>
-          </w:p>
-        </w:tc>
-        <w:tc>
-          <w:tcPr>
-            <w:tcW w:type="dxa" w:w="4986"/>
-          </w:tcPr>
-          <w:p>
-            <w:r>
-              <w:rPr>
-                <w:rFonts w:ascii="游ゴシック" w:hAnsi="游ゴシック" w:eastAsia="游ゴシック"/>
-                <w:sz w:val="20"/>
-              </w:rPr>
-              <w:t>teirei-houkoku</w:t>
-            </w:r>
-          </w:p>
-        </w:tc>
-      </w:tr>
-      <w:tr>
-        <w:tc>
-          <w:tcPr>
-            <w:tcW w:type="dxa" w:w="4986"/>
-          </w:tcPr>
-          <w:p>
-            <w:r>
-              <w:rPr>
-                <w:rFonts w:ascii="游ゴシック" w:hAnsi="游ゴシック" w:eastAsia="游ゴシック"/>
-                <w:sz w:val="20"/>
-              </w:rPr>
               <w:t>デプロイブランチ</w:t>
             </w:r>
           </w:p>
@@ -1619,7 +1661,7 @@
                 <w:rFonts w:ascii="游ゴシック" w:hAnsi="游ゴシック" w:eastAsia="游ゴシック"/>
                 <w:sz w:val="20"/>
               </w:rPr>
-              <w:t>デプロイ方式</w:t>
+              <w:t>公開フォルダ</w:t>
             </w:r>
           </w:p>
         </w:tc>
@@ -1633,7 +1675,37 @@
                 <w:rFonts w:ascii="游ゴシック" w:hAnsi="游ゴシック" w:eastAsia="游ゴシック"/>
                 <w:sz w:val="20"/>
               </w:rPr>
-              <w:t>GitHub連携・push検知で自動デプロイ</w:t>
+              <w:t>/ (root)</w:t>
+            </w:r>
+          </w:p>
+        </w:tc>
+      </w:tr>
+      <w:tr>
+        <w:tc>
+          <w:tcPr>
+            <w:tcW w:type="dxa" w:w="4986"/>
+          </w:tcPr>
+          <w:p>
+            <w:r>
+              <w:rPr>
+                <w:rFonts w:ascii="游ゴシック" w:hAnsi="游ゴシック" w:eastAsia="游ゴシック"/>
+                <w:sz w:val="20"/>
+              </w:rPr>
+              <w:t>ビルド</w:t>
+            </w:r>
+          </w:p>
+        </w:tc>
+        <w:tc>
+          <w:tcPr>
+            <w:tcW w:type="dxa" w:w="4986"/>
+          </w:tcPr>
+          <w:p>
+            <w:r>
+              <w:rPr>
+                <w:rFonts w:ascii="游ゴシック" w:hAnsi="游ゴシック" w:eastAsia="游ゴシック"/>
+                <w:sz w:val="20"/>
+              </w:rPr>
+              <w:t>なし（静的ファイル直接配信）</w:t>
             </w:r>
           </w:p>
         </w:tc>
@@ -1776,7 +1848,7 @@
           <w:rFonts w:ascii="游ゴシック" w:hAnsi="游ゴシック" w:eastAsia="游ゴシック"/>
           <w:sz w:val="21"/>
         </w:rPr>
-        <w:t>30秒以内に公開URLで最新版を確認できる</w:t>
+        <w:t>約1分以内に公開URLで最新版を確認できる</w:t>
       </w:r>
     </w:p>
     <w:tbl>
@@ -1942,7 +2014,7 @@
           <w:rFonts w:ascii="游ゴシック" w:hAnsi="游ゴシック" w:eastAsia="游ゴシック"/>
           <w:sz w:val="21"/>
         </w:rPr>
-        <w:t>Netlify無料枠：月間100GB帯域（個人利用では十分）</w:t>
+        <w:t>GitHub Pages：完全無料、月間100GB帯域、ビルド時間制限なし（静的のため）</w:t>
       </w:r>
     </w:p>
     <w:p>
@@ -1969,7 +2041,7 @@
           <w:color w:val="333333"/>
           <w:sz w:val="27"/>
         </w:rPr>
-        <w:t>4-6. 旧Netlify方式について（参考）</w:t>
+        <w:t>4-6. Netlify運用からの移行について（経緯）</w:t>
       </w:r>
     </w:p>
     <w:p>
@@ -1982,7 +2054,46 @@
           <w:b w:val="0"/>
           <w:sz w:val="21"/>
         </w:rPr>
-        <w:t>以前は「公開用」フォルダをNetlifyにドラッグする方式でしたが、GitHub連携でこの手順は不要になりました。「公開用」フォルダと「公開用を更新.bat」は念のため残してありますが、通常は使いません。</w:t>
+        <w:t>2026年6月5日まではNetlify（https://teirei-houkoku.netlify.app）で運用していましたが、Netlifyのアカウントクレジット限度額超過により本番展開がブロックされたため、GitHub Pagesへ移行しました。GitHub Pagesはクレジット制限がないため、永続的に無料運用できます。</w:t>
+      </w:r>
+    </w:p>
+    <w:p>
+      <w:pPr>
+        <w:pStyle w:val="ListBullet"/>
+        <w:spacing w:after="40"/>
+      </w:pPr>
+      <w:r>
+        <w:rPr>
+          <w:rFonts w:ascii="游ゴシック" w:hAnsi="游ゴシック" w:eastAsia="游ゴシック"/>
+          <w:sz w:val="21"/>
+        </w:rPr>
+        <w:t>旧URL： https://teirei-houkoku.netlify.app （停止中、月次リセットで復活する可能性あり）</w:t>
+      </w:r>
+    </w:p>
+    <w:p>
+      <w:pPr>
+        <w:pStyle w:val="ListBullet"/>
+        <w:spacing w:after="40"/>
+      </w:pPr>
+      <w:r>
+        <w:rPr>
+          <w:rFonts w:ascii="游ゴシック" w:hAnsi="游ゴシック" w:eastAsia="游ゴシック"/>
+          <w:sz w:val="21"/>
+        </w:rPr>
+        <w:t>新URL： https://abe2300.github.io/ebachan/ （現行）</w:t>
+      </w:r>
+    </w:p>
+    <w:p>
+      <w:pPr>
+        <w:pStyle w:val="ListBullet"/>
+        <w:spacing w:after="40"/>
+      </w:pPr>
+      <w:r>
+        <w:rPr>
+          <w:rFonts w:ascii="游ゴシック" w:hAnsi="游ゴシック" w:eastAsia="游ゴシック"/>
+          <w:sz w:val="21"/>
+        </w:rPr>
+        <w:t>「公開用」フォルダと「公開用を更新.bat」は旧Netlify Drop方式の名残で、現在は使いません。</w:t>
       </w:r>
     </w:p>
     <w:p>
@@ -2039,7 +2150,7 @@
           <w:rFonts w:ascii="游ゴシック" w:hAnsi="游ゴシック" w:eastAsia="游ゴシック"/>
           <w:sz w:val="21"/>
         </w:rPr>
-        <w:t>Safari で Netlify の公開URLを開く</w:t>
+        <w:t>Safari で公開URL（https://abe2300.github.io/ebachan/）を開く</w:t>
       </w:r>
     </w:p>
     <w:p>
@@ -2118,7 +2229,7 @@
           <w:rFonts w:ascii="游ゴシック" w:hAnsi="游ゴシック" w:eastAsia="游ゴシック"/>
           <w:sz w:val="21"/>
         </w:rPr>
-        <w:t>Chromeで Netlify の公開URLを開く</w:t>
+        <w:t>Chromeで公開URL（https://abe2300.github.io/ebachan/）を開く</w:t>
       </w:r>
     </w:p>
     <w:p>
@@ -2188,6 +2299,106 @@
                 <w:sz w:val="20"/>
               </w:rPr>
               <w:t>💡 PWA化のメリット：オフラインでも閲覧可、起動が早い、ブラウザのURLバーが表示されない（アプリ風）</w:t>
+            </w:r>
+          </w:p>
+        </w:tc>
+      </w:tr>
+    </w:tbl>
+    <w:p/>
+    <w:p>
+      <w:pPr>
+        <w:spacing w:before="160" w:after="40"/>
+      </w:pPr>
+      <w:r>
+        <w:rPr>
+          <w:rFonts w:ascii="游ゴシック" w:hAnsi="游ゴシック" w:eastAsia="游ゴシック"/>
+          <w:b/>
+          <w:color w:val="1E3A8A"/>
+          <w:sz w:val="23"/>
+        </w:rPr>
+        <w:t>■ 旧PWA（Netlify版）からの移行</w:t>
+      </w:r>
+    </w:p>
+    <w:p>
+      <w:pPr>
+        <w:spacing w:after="80"/>
+      </w:pPr>
+      <w:r>
+        <w:rPr>
+          <w:rFonts w:ascii="游ゴシック" w:hAnsi="游ゴシック" w:eastAsia="游ゴシック"/>
+          <w:b w:val="0"/>
+          <w:sz w:val="21"/>
+        </w:rPr>
+        <w:t>以前 https://teirei-houkoku.netlify.app からPWAをインストールしていた場合は、以下の手順で再インストールしてください：</w:t>
+      </w:r>
+    </w:p>
+    <w:p>
+      <w:pPr>
+        <w:pStyle w:val="ListNumber"/>
+        <w:spacing w:after="40"/>
+      </w:pPr>
+      <w:r>
+        <w:rPr>
+          <w:rFonts w:ascii="游ゴシック" w:hAnsi="游ゴシック" w:eastAsia="游ゴシック"/>
+          <w:sz w:val="21"/>
+        </w:rPr>
+        <w:t>ホーム画面の旧「定例報告」アイコンを長押し → 削除</w:t>
+      </w:r>
+    </w:p>
+    <w:p>
+      <w:pPr>
+        <w:pStyle w:val="ListNumber"/>
+        <w:spacing w:after="40"/>
+      </w:pPr>
+      <w:r>
+        <w:rPr>
+          <w:rFonts w:ascii="游ゴシック" w:hAnsi="游ゴシック" w:eastAsia="游ゴシック"/>
+          <w:sz w:val="21"/>
+        </w:rPr>
+        <w:t>新公開URL（https://abe2300.github.io/ebachan/）にスマホブラウザでアクセス</w:t>
+      </w:r>
+    </w:p>
+    <w:p>
+      <w:pPr>
+        <w:pStyle w:val="ListNumber"/>
+        <w:spacing w:after="40"/>
+      </w:pPr>
+      <w:r>
+        <w:rPr>
+          <w:rFonts w:ascii="游ゴシック" w:hAnsi="游ゴシック" w:eastAsia="游ゴシック"/>
+          <w:sz w:val="21"/>
+        </w:rPr>
+        <w:t>上記手順で再度「ホーム画面に追加」</w:t>
+      </w:r>
+    </w:p>
+    <w:tbl>
+      <w:tblPr>
+        <w:tblW w:type="auto" w:w="0"/>
+        <w:tblLayout w:type="autofit"/>
+        <w:tblLook w:firstColumn="1" w:firstRow="1" w:lastColumn="0" w:lastRow="0" w:noHBand="0" w:noVBand="1" w:val="04A0"/>
+      </w:tblPr>
+      <w:tblGrid>
+        <w:gridCol w:w="9972"/>
+      </w:tblGrid>
+      <w:tr>
+        <w:tc>
+          <w:tcPr>
+            <w:tcW w:type="dxa" w:w="9972"/>
+            <w:shd w:val="clear" w:color="auto" w:fill="FFF8E1"/>
+            <w:tcBorders>
+              <w:top w:val="single" w:sz="8" w:color="F59E0B"/>
+              <w:left w:val="single" w:sz="8" w:color="F59E0B"/>
+              <w:bottom w:val="single" w:sz="8" w:color="F59E0B"/>
+              <w:right w:val="single" w:sz="8" w:color="F59E0B"/>
+            </w:tcBorders>
+          </w:tcPr>
+          <w:p>
+            <w:r>
+              <w:rPr>
+                <w:rFonts w:ascii="游ゴシック" w:hAnsi="游ゴシック" w:eastAsia="游ゴシック"/>
+                <w:sz w:val="20"/>
+              </w:rPr>
+              <w:t>⚠️ URLが変わったため、PWAは別アプリ扱いになります。再インストール必須です。</w:t>
             </w:r>
           </w:p>
         </w:tc>
@@ -2446,7 +2657,7 @@
                 <w:rFonts w:ascii="游ゴシック" w:hAnsi="游ゴシック" w:eastAsia="游ゴシック"/>
                 <w:sz w:val="20"/>
               </w:rPr>
-              <w:t>📱 スマホで更新したい場合：claude.ai でニュース取得 → GitHub.com で index.html を手動編集 → コミット → Netlify自動デプロイ。ただし所要時間10～15分とPC運用より大変なので、PC運用がおすすめです。</w:t>
+              <w:t>📱 スマホで更新したい場合：claude.ai でニュース取得 → GitHub.com で index.html を手動編集 → コミット → GitHub Pages自動デプロイ。ただし所要時間10～15分とPC運用より大変なので、PC運用がおすすめです。</w:t>
             </w:r>
           </w:p>
         </w:tc>
@@ -2559,7 +2770,7 @@
           <w:rFonts w:ascii="游ゴシック" w:hAnsi="游ゴシック" w:eastAsia="游ゴシック"/>
           <w:sz w:val="21"/>
         </w:rPr>
-        <w:t>「Push成功!」が表示されれば完了 — 30秒以内に公開URLに反映</w:t>
+        <w:t>「Push成功!」が表示されれば完了 — 約1分以内に公開URL（https://abe2300.github.io/ebachan/）に反映</w:t>
       </w:r>
     </w:p>
     <w:tbl>
@@ -3491,7 +3702,7 @@
           <w:rFonts w:ascii="游ゴシック" w:hAnsi="游ゴシック" w:eastAsia="游ゴシック"/>
           <w:sz w:val="21"/>
         </w:rPr>
-        <w:t>「公開用を更新.bat」→ Netlifyに公開</w:t>
+        <w:t>「GitHubに更新.bat」→ GitHub Pagesに公開</w:t>
       </w:r>
     </w:p>
     <w:p>
@@ -3772,7 +3983,7 @@
           <w:rFonts w:ascii="游ゴシック" w:hAnsi="游ゴシック" w:eastAsia="游ゴシック"/>
           <w:sz w:val="21"/>
         </w:rPr>
-        <w:t>自動で git push → Netlify公開</w:t>
+        <w:t>自動で git push → GitHub Pages公開</w:t>
       </w:r>
     </w:p>
     <w:p>
@@ -4189,7 +4400,7 @@
                 <w:rFonts w:ascii="游ゴシック" w:hAnsi="游ゴシック" w:eastAsia="游ゴシック"/>
                 <w:sz w:val="20"/>
               </w:rPr>
-              <w:t>Netlifyに公開が反映されない</w:t>
+              <w:t>GitHub Pagesに公開が反映されない</w:t>
             </w:r>
           </w:p>
         </w:tc>
@@ -4203,7 +4414,7 @@
                 <w:rFonts w:ascii="游ゴシック" w:hAnsi="游ゴシック" w:eastAsia="游ゴシック"/>
                 <w:sz w:val="20"/>
               </w:rPr>
-              <w:t>GitHubリポジトリでcommitが届いているか確認。Netlifyダッシュボードの「Deploys」タブでビルド状況を確認。</w:t>
+              <w:t>Settings → Pages でデプロイ状況を確認。Actions タブで「pages-build-deployment」が成功しているか確認。約1分かかります。</w:t>
             </w:r>
           </w:p>
         </w:tc>
@@ -4219,7 +4430,7 @@
                 <w:rFonts w:ascii="游ゴシック" w:hAnsi="游ゴシック" w:eastAsia="游ゴシック"/>
                 <w:sz w:val="20"/>
               </w:rPr>
-              <w:t>Netlifyビルドが失敗</w:t>
+              <w:t>GitHub Pagesが404になる</w:t>
             </w:r>
           </w:p>
         </w:tc>
@@ -4233,7 +4444,37 @@
                 <w:rFonts w:ascii="游ゴシック" w:hAnsi="游ゴシック" w:eastAsia="游ゴシック"/>
                 <w:sz w:val="20"/>
               </w:rPr>
-              <w:t>Netlifyの「Deploy log」でエラー内容を確認。基本的に静的HTMLなので失敗しないはず。</w:t>
+              <w:t>Settings → Pages で Source が「main / root」になっているか確認。初回有効化後、数分待つ必要があります。</w:t>
+            </w:r>
+          </w:p>
+        </w:tc>
+      </w:tr>
+      <w:tr>
+        <w:tc>
+          <w:tcPr>
+            <w:tcW w:type="dxa" w:w="4986"/>
+          </w:tcPr>
+          <w:p>
+            <w:r>
+              <w:rPr>
+                <w:rFonts w:ascii="游ゴシック" w:hAnsi="游ゴシック" w:eastAsia="游ゴシック"/>
+                <w:sz w:val="20"/>
+              </w:rPr>
+              <w:t>旧Netlify URLが繋がらない</w:t>
+            </w:r>
+          </w:p>
+        </w:tc>
+        <w:tc>
+          <w:tcPr>
+            <w:tcW w:type="dxa" w:w="4986"/>
+          </w:tcPr>
+          <w:p>
+            <w:r>
+              <w:rPr>
+                <w:rFonts w:ascii="游ゴシック" w:hAnsi="游ゴシック" w:eastAsia="游ゴシック"/>
+                <w:sz w:val="20"/>
+              </w:rPr>
+              <w:t>クレジット切れで停止中。新URL https://abe2300.github.io/ebachan/ を使用してください。</w:t>
             </w:r>
           </w:p>
         </w:tc>
@@ -4263,7 +4504,7 @@
                 <w:rFonts w:ascii="游ゴシック" w:hAnsi="游ゴシック" w:eastAsia="游ゴシック"/>
                 <w:sz w:val="20"/>
               </w:rPr>
-              <w:t>Service Worker のキャッシュ。sw.jsのCACHE名を v5→v6 などに変更してデプロイ。</w:t>
+              <w:t>Service Worker のキャッシュ。sw.jsのCACHE名を v6→v7 などに変更してデプロイ。それでもダメな場合はPWA削除→再インストール。</w:t>
             </w:r>
           </w:p>
         </w:tc>
@@ -4294,6 +4535,36 @@
                 <w:sz w:val="20"/>
               </w:rPr>
               <w:t>スマホのキャッシュを削除→再度ホーム画面に追加。</w:t>
+            </w:r>
+          </w:p>
+        </w:tc>
+      </w:tr>
+      <w:tr>
+        <w:tc>
+          <w:tcPr>
+            <w:tcW w:type="dxa" w:w="4986"/>
+          </w:tcPr>
+          <w:p>
+            <w:r>
+              <w:rPr>
+                <w:rFonts w:ascii="游ゴシック" w:hAnsi="游ゴシック" w:eastAsia="游ゴシック"/>
+                <w:sz w:val="20"/>
+              </w:rPr>
+              <w:t>旧PWA（Netlify版）がエラー</w:t>
+            </w:r>
+          </w:p>
+        </w:tc>
+        <w:tc>
+          <w:tcPr>
+            <w:tcW w:type="dxa" w:w="4986"/>
+          </w:tcPr>
+          <w:p>
+            <w:r>
+              <w:rPr>
+                <w:rFonts w:ascii="游ゴシック" w:hAnsi="游ゴシック" w:eastAsia="游ゴシック"/>
+                <w:sz w:val="20"/>
+              </w:rPr>
+              <w:t>URLが変わっているため使えません。新URL（GitHub Pages版）でPWAを再インストールしてください。</w:t>
             </w:r>
           </w:p>
         </w:tc>

</xml_diff>

<commit_message>
Add operation pattern comparison table and detailed launch procedures to manual
</commit_message>
<xml_diff>
--- a/定例報告_運用手順書.docx
+++ b/定例報告_運用手順書.docx
@@ -2692,7 +2692,397 @@
           <w:color w:val="333333"/>
           <w:sz w:val="27"/>
         </w:rPr>
-        <w:t>6-1. 毎朝の流れ（C案：ワンクリック公開）</w:t>
+        <w:t>6-1. 運用パターン早見表</w:t>
+      </w:r>
+    </w:p>
+    <w:p>
+      <w:pPr>
+        <w:spacing w:after="80"/>
+      </w:pPr>
+      <w:r>
+        <w:rPr>
+          <w:rFonts w:ascii="游ゴシック" w:hAnsi="游ゴシック" w:eastAsia="游ゴシック"/>
+          <w:b w:val="0"/>
+          <w:sz w:val="21"/>
+        </w:rPr>
+        <w:t>定例報告の運用には4つのパターンがあります。自分に合った方法を選んでください。</w:t>
+      </w:r>
+    </w:p>
+    <w:tbl>
+      <w:tblPr>
+        <w:tblStyle w:val="LightGrid-Accent1"/>
+        <w:tblW w:type="auto" w:w="0"/>
+        <w:tblLook w:firstColumn="1" w:firstRow="1" w:lastColumn="0" w:lastRow="0" w:noHBand="0" w:noVBand="1" w:val="04A0"/>
+      </w:tblPr>
+      <w:tblGrid>
+        <w:gridCol w:w="2493"/>
+        <w:gridCol w:w="2493"/>
+        <w:gridCol w:w="2493"/>
+        <w:gridCol w:w="2493"/>
+      </w:tblGrid>
+      <w:tr>
+        <w:tc>
+          <w:tcPr>
+            <w:tcW w:type="dxa" w:w="2493"/>
+            <w:shd w:val="clear" w:color="auto" w:fill="1E3A8A"/>
+          </w:tcPr>
+          <w:p>
+            <w:r>
+              <w:rPr>
+                <w:rFonts w:ascii="游ゴシック" w:hAnsi="游ゴシック" w:eastAsia="游ゴシック"/>
+                <w:b/>
+                <w:color w:val="FFFFFF"/>
+                <w:sz w:val="21"/>
+              </w:rPr>
+              <w:t>パターン</w:t>
+            </w:r>
+          </w:p>
+        </w:tc>
+        <w:tc>
+          <w:tcPr>
+            <w:tcW w:type="dxa" w:w="2493"/>
+            <w:shd w:val="clear" w:color="auto" w:fill="1E3A8A"/>
+          </w:tcPr>
+          <w:p>
+            <w:r>
+              <w:rPr>
+                <w:rFonts w:ascii="游ゴシック" w:hAnsi="游ゴシック" w:eastAsia="游ゴシック"/>
+                <w:b/>
+                <w:color w:val="FFFFFF"/>
+                <w:sz w:val="21"/>
+              </w:rPr>
+              <w:t>操作ステップ</w:t>
+            </w:r>
+          </w:p>
+        </w:tc>
+        <w:tc>
+          <w:tcPr>
+            <w:tcW w:type="dxa" w:w="2493"/>
+            <w:shd w:val="clear" w:color="auto" w:fill="1E3A8A"/>
+          </w:tcPr>
+          <w:p>
+            <w:r>
+              <w:rPr>
+                <w:rFonts w:ascii="游ゴシック" w:hAnsi="游ゴシック" w:eastAsia="游ゴシック"/>
+                <w:b/>
+                <w:color w:val="FFFFFF"/>
+                <w:sz w:val="21"/>
+              </w:rPr>
+              <w:t>必要なBAT</w:t>
+            </w:r>
+          </w:p>
+        </w:tc>
+        <w:tc>
+          <w:tcPr>
+            <w:tcW w:type="dxa" w:w="2493"/>
+            <w:shd w:val="clear" w:color="auto" w:fill="1E3A8A"/>
+          </w:tcPr>
+          <w:p>
+            <w:r>
+              <w:rPr>
+                <w:rFonts w:ascii="游ゴシック" w:hAnsi="游ゴシック" w:eastAsia="游ゴシック"/>
+                <w:b/>
+                <w:color w:val="FFFFFF"/>
+                <w:sz w:val="21"/>
+              </w:rPr>
+              <w:t>自動化度</w:t>
+            </w:r>
+          </w:p>
+        </w:tc>
+      </w:tr>
+      <w:tr>
+        <w:tc>
+          <w:tcPr>
+            <w:tcW w:type="dxa" w:w="2493"/>
+          </w:tcPr>
+          <w:p>
+            <w:r>
+              <w:rPr>
+                <w:rFonts w:ascii="游ゴシック" w:hAnsi="游ゴシック" w:eastAsia="游ゴシック"/>
+                <w:sz w:val="20"/>
+              </w:rPr>
+              <w:t>A：手動運用（標準）</w:t>
+            </w:r>
+          </w:p>
+        </w:tc>
+        <w:tc>
+          <w:tcPr>
+            <w:tcW w:type="dxa" w:w="2493"/>
+          </w:tcPr>
+          <w:p>
+            <w:r>
+              <w:rPr>
+                <w:rFonts w:ascii="游ゴシック" w:hAnsi="游ゴシック" w:eastAsia="游ゴシック"/>
+                <w:sz w:val="20"/>
+              </w:rPr>
+              <w:t>4ステップ：Claude起動→「定例報告」入力→更新確認→bat実行</w:t>
+            </w:r>
+          </w:p>
+        </w:tc>
+        <w:tc>
+          <w:tcPr>
+            <w:tcW w:type="dxa" w:w="2493"/>
+          </w:tcPr>
+          <w:p>
+            <w:r>
+              <w:rPr>
+                <w:rFonts w:ascii="游ゴシック" w:hAnsi="游ゴシック" w:eastAsia="游ゴシック"/>
+                <w:sz w:val="20"/>
+              </w:rPr>
+              <w:t>GitHubに更新.bat</w:t>
+            </w:r>
+          </w:p>
+        </w:tc>
+        <w:tc>
+          <w:tcPr>
+            <w:tcW w:type="dxa" w:w="2493"/>
+          </w:tcPr>
+          <w:p>
+            <w:r>
+              <w:rPr>
+                <w:rFonts w:ascii="游ゴシック" w:hAnsi="游ゴシック" w:eastAsia="游ゴシック"/>
+                <w:sz w:val="20"/>
+              </w:rPr>
+              <w:t>△ 基本</w:t>
+            </w:r>
+          </w:p>
+        </w:tc>
+      </w:tr>
+      <w:tr>
+        <w:tc>
+          <w:tcPr>
+            <w:tcW w:type="dxa" w:w="2493"/>
+          </w:tcPr>
+          <w:p>
+            <w:r>
+              <w:rPr>
+                <w:rFonts w:ascii="游ゴシック" w:hAnsi="游ゴシック" w:eastAsia="游ゴシック"/>
+                <w:sz w:val="20"/>
+              </w:rPr>
+              <w:t>B：朝の自動更新bat</w:t>
+            </w:r>
+          </w:p>
+        </w:tc>
+        <w:tc>
+          <w:tcPr>
+            <w:tcW w:type="dxa" w:w="2493"/>
+          </w:tcPr>
+          <w:p>
+            <w:r>
+              <w:rPr>
+                <w:rFonts w:ascii="游ゴシック" w:hAnsi="游ゴシック" w:eastAsia="游ゴシック"/>
+                <w:sz w:val="20"/>
+              </w:rPr>
+              <w:t>2ステップ：bat起動→「定例報告」入力→Enter</w:t>
+            </w:r>
+          </w:p>
+        </w:tc>
+        <w:tc>
+          <w:tcPr>
+            <w:tcW w:type="dxa" w:w="2493"/>
+          </w:tcPr>
+          <w:p>
+            <w:r>
+              <w:rPr>
+                <w:rFonts w:ascii="游ゴシック" w:hAnsi="游ゴシック" w:eastAsia="游ゴシック"/>
+                <w:sz w:val="20"/>
+              </w:rPr>
+              <w:t>朝の自動更新.bat</w:t>
+            </w:r>
+          </w:p>
+        </w:tc>
+        <w:tc>
+          <w:tcPr>
+            <w:tcW w:type="dxa" w:w="2493"/>
+          </w:tcPr>
+          <w:p>
+            <w:r>
+              <w:rPr>
+                <w:rFonts w:ascii="游ゴシック" w:hAnsi="游ゴシック" w:eastAsia="游ゴシック"/>
+                <w:sz w:val="20"/>
+              </w:rPr>
+              <w:t>○ 楽</w:t>
+            </w:r>
+          </w:p>
+        </w:tc>
+      </w:tr>
+      <w:tr>
+        <w:tc>
+          <w:tcPr>
+            <w:tcW w:type="dxa" w:w="2493"/>
+          </w:tcPr>
+          <w:p>
+            <w:r>
+              <w:rPr>
+                <w:rFonts w:ascii="游ゴシック" w:hAnsi="游ゴシック" w:eastAsia="游ゴシック"/>
+                <w:sz w:val="20"/>
+              </w:rPr>
+              <w:t>C：タスクスケジューラ</w:t>
+            </w:r>
+          </w:p>
+        </w:tc>
+        <w:tc>
+          <w:tcPr>
+            <w:tcW w:type="dxa" w:w="2493"/>
+          </w:tcPr>
+          <w:p>
+            <w:r>
+              <w:rPr>
+                <w:rFonts w:ascii="游ゴシック" w:hAnsi="游ゴシック" w:eastAsia="游ゴシック"/>
+                <w:sz w:val="20"/>
+              </w:rPr>
+              <w:t>2ステップ：（自動起動）→「定例報告」入力→Enter</w:t>
+            </w:r>
+          </w:p>
+        </w:tc>
+        <w:tc>
+          <w:tcPr>
+            <w:tcW w:type="dxa" w:w="2493"/>
+          </w:tcPr>
+          <w:p>
+            <w:r>
+              <w:rPr>
+                <w:rFonts w:ascii="游ゴシック" w:hAnsi="游ゴシック" w:eastAsia="游ゴシック"/>
+                <w:sz w:val="20"/>
+              </w:rPr>
+              <w:t>タスクスケジューラ_設定.bat（初回のみ）</w:t>
+            </w:r>
+          </w:p>
+        </w:tc>
+        <w:tc>
+          <w:tcPr>
+            <w:tcW w:type="dxa" w:w="2493"/>
+          </w:tcPr>
+          <w:p>
+            <w:r>
+              <w:rPr>
+                <w:rFonts w:ascii="游ゴシック" w:hAnsi="游ゴシック" w:eastAsia="游ゴシック"/>
+                <w:sz w:val="20"/>
+              </w:rPr>
+              <w:t>◎ 半自動</w:t>
+            </w:r>
+          </w:p>
+        </w:tc>
+      </w:tr>
+      <w:tr>
+        <w:tc>
+          <w:tcPr>
+            <w:tcW w:type="dxa" w:w="2493"/>
+          </w:tcPr>
+          <w:p>
+            <w:r>
+              <w:rPr>
+                <w:rFonts w:ascii="游ゴシック" w:hAnsi="游ゴシック" w:eastAsia="游ゴシック"/>
+                <w:sz w:val="20"/>
+              </w:rPr>
+              <w:t>D：/schedule（クラウド）</w:t>
+            </w:r>
+          </w:p>
+        </w:tc>
+        <w:tc>
+          <w:tcPr>
+            <w:tcW w:type="dxa" w:w="2493"/>
+          </w:tcPr>
+          <w:p>
+            <w:r>
+              <w:rPr>
+                <w:rFonts w:ascii="游ゴシック" w:hAnsi="游ゴシック" w:eastAsia="游ゴシック"/>
+                <w:sz w:val="20"/>
+              </w:rPr>
+              <w:t>0ステップ：完全自動（現在利用不可）</w:t>
+            </w:r>
+          </w:p>
+        </w:tc>
+        <w:tc>
+          <w:tcPr>
+            <w:tcW w:type="dxa" w:w="2493"/>
+          </w:tcPr>
+          <w:p>
+            <w:r>
+              <w:rPr>
+                <w:rFonts w:ascii="游ゴシック" w:hAnsi="游ゴシック" w:eastAsia="游ゴシック"/>
+                <w:sz w:val="20"/>
+              </w:rPr>
+              <w:t>なし</w:t>
+            </w:r>
+          </w:p>
+        </w:tc>
+        <w:tc>
+          <w:tcPr>
+            <w:tcW w:type="dxa" w:w="2493"/>
+          </w:tcPr>
+          <w:p>
+            <w:r>
+              <w:rPr>
+                <w:rFonts w:ascii="游ゴシック" w:hAnsi="游ゴシック" w:eastAsia="游ゴシック"/>
+                <w:sz w:val="20"/>
+              </w:rPr>
+              <w:t>◎◎ 完全自動</w:t>
+            </w:r>
+          </w:p>
+        </w:tc>
+      </w:tr>
+    </w:tbl>
+    <w:p/>
+    <w:tbl>
+      <w:tblPr>
+        <w:tblW w:type="auto" w:w="0"/>
+        <w:tblLayout w:type="autofit"/>
+        <w:tblLook w:firstColumn="1" w:firstRow="1" w:lastColumn="0" w:lastRow="0" w:noHBand="0" w:noVBand="1" w:val="04A0"/>
+      </w:tblPr>
+      <w:tblGrid>
+        <w:gridCol w:w="9972"/>
+      </w:tblGrid>
+      <w:tr>
+        <w:tc>
+          <w:tcPr>
+            <w:tcW w:type="dxa" w:w="9972"/>
+            <w:shd w:val="clear" w:color="auto" w:fill="FFF8E1"/>
+            <w:tcBorders>
+              <w:top w:val="single" w:sz="8" w:color="F59E0B"/>
+              <w:left w:val="single" w:sz="8" w:color="F59E0B"/>
+              <w:bottom w:val="single" w:sz="8" w:color="F59E0B"/>
+              <w:right w:val="single" w:sz="8" w:color="F59E0B"/>
+            </w:tcBorders>
+          </w:tcPr>
+          <w:p>
+            <w:r>
+              <w:rPr>
+                <w:rFonts w:ascii="游ゴシック" w:hAnsi="游ゴシック" w:eastAsia="游ゴシック"/>
+                <w:sz w:val="20"/>
+              </w:rPr>
+              <w:t>💡 「BATを起動するだけ」で完結はしません。ニュース内容の生成はClaudeにしかできないため、必ず「定例報告」と入力する1ステップは残ります（パターンDのみ例外）。</w:t>
+            </w:r>
+          </w:p>
+        </w:tc>
+      </w:tr>
+    </w:tbl>
+    <w:p/>
+    <w:p>
+      <w:pPr>
+        <w:spacing w:before="240" w:after="80"/>
+      </w:pPr>
+      <w:r>
+        <w:rPr>
+          <w:rFonts w:ascii="游ゴシック" w:hAnsi="游ゴシック" w:eastAsia="游ゴシック"/>
+          <w:b/>
+          <w:color w:val="333333"/>
+          <w:sz w:val="27"/>
+        </w:rPr>
+        <w:t>6-2. パターンA：手動運用（標準）の手順</w:t>
+      </w:r>
+    </w:p>
+    <w:p>
+      <w:pPr>
+        <w:spacing w:after="80"/>
+      </w:pPr>
+      <w:r>
+        <w:rPr>
+          <w:rFonts w:ascii="游ゴシック" w:hAnsi="游ゴシック" w:eastAsia="游ゴシック"/>
+          <w:b w:val="0"/>
+          <w:sz w:val="21"/>
+        </w:rPr>
+        <w:t>最もシンプルな運用方法です。普段はこの方法で十分です。</w:t>
       </w:r>
     </w:p>
     <w:p>
@@ -2705,7 +3095,7 @@
           <w:rFonts w:ascii="游ゴシック" w:hAnsi="游ゴシック" w:eastAsia="游ゴシック"/>
           <w:sz w:val="21"/>
         </w:rPr>
-        <w:t>Claude Code を開く</w:t>
+        <w:t>Claude Code を起動する（ショートカットまたは「claude」コマンド）</w:t>
       </w:r>
     </w:p>
     <w:p>
@@ -2731,7 +3121,7 @@
           <w:rFonts w:ascii="游ゴシック" w:hAnsi="游ゴシック" w:eastAsia="游ゴシック"/>
           <w:sz w:val="21"/>
         </w:rPr>
-        <w:t>Claudeが最新の経済ニュース5件＋株価影響コメントを生成</w:t>
+        <w:t>Claudeが最新の経済ニュース5件＋株価影響コメントを生成して index.html を直接更新</w:t>
       </w:r>
     </w:p>
     <w:p>
@@ -2744,7 +3134,7 @@
           <w:rFonts w:ascii="游ゴシック" w:hAnsi="游ゴシック" w:eastAsia="游ゴシック"/>
           <w:sz w:val="21"/>
         </w:rPr>
-        <w:t>Claudeが index.html を直接更新（日付・ニュース内容）</w:t>
+        <w:t>更新内容を確認したら「GitHubに更新.bat」をダブルクリック</w:t>
       </w:r>
     </w:p>
     <w:p>
@@ -2757,7 +3147,7 @@
           <w:rFonts w:ascii="游ゴシック" w:hAnsi="游ゴシック" w:eastAsia="游ゴシック"/>
           <w:sz w:val="21"/>
         </w:rPr>
-        <w:t>「GitHubに更新.bat」をダブルクリック</w:t>
+        <w:t>黒い画面に「Push成功!」が表示されれば完了</w:t>
       </w:r>
     </w:p>
     <w:p>
@@ -2770,7 +3160,7 @@
           <w:rFonts w:ascii="游ゴシック" w:hAnsi="游ゴシック" w:eastAsia="游ゴシック"/>
           <w:sz w:val="21"/>
         </w:rPr>
-        <w:t>「Push成功!」が表示されれば完了 — 約1分以内に公開URL（https://abe2300.github.io/ebachan/）に反映</w:t>
+        <w:t>約1分以内に https://abe2300.github.io/ebachan/ に反映</w:t>
       </w:r>
     </w:p>
     <w:tbl>
@@ -2818,7 +3208,571 @@
           <w:color w:val="333333"/>
           <w:sz w:val="27"/>
         </w:rPr>
-        <w:t>6-2. ニュース項目を変更する場合</w:t>
+        <w:t>6-3. パターンB：朝の自動更新.bat の手順</w:t>
+      </w:r>
+    </w:p>
+    <w:p>
+      <w:pPr>
+        <w:spacing w:after="80"/>
+      </w:pPr>
+      <w:r>
+        <w:rPr>
+          <w:rFonts w:ascii="游ゴシック" w:hAnsi="游ゴシック" w:eastAsia="游ゴシック"/>
+          <w:b w:val="0"/>
+          <w:sz w:val="21"/>
+        </w:rPr>
+        <w:t>BATをダブルクリックするだけで、Claude Code起動からpushまで半自動化されます。</w:t>
+      </w:r>
+    </w:p>
+    <w:p>
+      <w:pPr>
+        <w:spacing w:before="160" w:after="40"/>
+      </w:pPr>
+      <w:r>
+        <w:rPr>
+          <w:rFonts w:ascii="游ゴシック" w:hAnsi="游ゴシック" w:eastAsia="游ゴシック"/>
+          <w:b/>
+          <w:color w:val="1E3A8A"/>
+          <w:sz w:val="23"/>
+        </w:rPr>
+        <w:t>■ 起動手順</w:t>
+      </w:r>
+    </w:p>
+    <w:p>
+      <w:pPr>
+        <w:pStyle w:val="ListNumber"/>
+        <w:spacing w:after="40"/>
+      </w:pPr>
+      <w:r>
+        <w:rPr>
+          <w:rFonts w:ascii="游ゴシック" w:hAnsi="游ゴシック" w:eastAsia="游ゴシック"/>
+          <w:sz w:val="21"/>
+        </w:rPr>
+        <w:t>「朝の自動更新.bat」をダブルクリック（デスクトップにショートカットを置くと便利）</w:t>
+      </w:r>
+    </w:p>
+    <w:p>
+      <w:pPr>
+        <w:pStyle w:val="ListNumber"/>
+        <w:spacing w:after="40"/>
+      </w:pPr>
+      <w:r>
+        <w:rPr>
+          <w:rFonts w:ascii="游ゴシック" w:hAnsi="游ゴシック" w:eastAsia="游ゴシック"/>
+          <w:sz w:val="21"/>
+        </w:rPr>
+        <w:t>デスクトップに通知「定例報告アプリ - 朝の自動更新時間です」が表示される</w:t>
+      </w:r>
+    </w:p>
+    <w:p>
+      <w:pPr>
+        <w:pStyle w:val="ListNumber"/>
+        <w:spacing w:after="40"/>
+      </w:pPr>
+      <w:r>
+        <w:rPr>
+          <w:rFonts w:ascii="游ゴシック" w:hAnsi="游ゴシック" w:eastAsia="游ゴシック"/>
+          <w:sz w:val="21"/>
+        </w:rPr>
+        <w:t>Claude Code が自動起動（ローカル版またはブラウザ版）</w:t>
+      </w:r>
+    </w:p>
+    <w:p>
+      <w:pPr>
+        <w:pStyle w:val="ListNumber"/>
+        <w:spacing w:after="40"/>
+      </w:pPr>
+      <w:r>
+        <w:rPr>
+          <w:rFonts w:ascii="游ゴシック" w:hAnsi="游ゴシック" w:eastAsia="游ゴシック"/>
+          <w:sz w:val="21"/>
+        </w:rPr>
+        <w:t>黒い画面に「作業完了後、Enterキーを押してください」と表示される</w:t>
+      </w:r>
+    </w:p>
+    <w:p>
+      <w:pPr>
+        <w:pStyle w:val="ListNumber"/>
+        <w:spacing w:after="40"/>
+      </w:pPr>
+      <w:r>
+        <w:rPr>
+          <w:rFonts w:ascii="游ゴシック" w:hAnsi="游ゴシック" w:eastAsia="游ゴシック"/>
+          <w:sz w:val="21"/>
+        </w:rPr>
+        <w:t>Claude Code 側で「定例報告」と入力 → Enter</w:t>
+      </w:r>
+    </w:p>
+    <w:p>
+      <w:pPr>
+        <w:pStyle w:val="ListNumber"/>
+        <w:spacing w:after="40"/>
+      </w:pPr>
+      <w:r>
+        <w:rPr>
+          <w:rFonts w:ascii="游ゴシック" w:hAnsi="游ゴシック" w:eastAsia="游ゴシック"/>
+          <w:sz w:val="21"/>
+        </w:rPr>
+        <w:t>Claudeが index.html を最新ニュースで更新（完了まで待つ）</w:t>
+      </w:r>
+    </w:p>
+    <w:p>
+      <w:pPr>
+        <w:pStyle w:val="ListNumber"/>
+        <w:spacing w:after="40"/>
+      </w:pPr>
+      <w:r>
+        <w:rPr>
+          <w:rFonts w:ascii="游ゴシック" w:hAnsi="游ゴシック" w:eastAsia="游ゴシック"/>
+          <w:sz w:val="21"/>
+        </w:rPr>
+        <w:t>黒い画面に戻って Enter キーを押す</w:t>
+      </w:r>
+    </w:p>
+    <w:p>
+      <w:pPr>
+        <w:pStyle w:val="ListNumber"/>
+        <w:spacing w:after="40"/>
+      </w:pPr>
+      <w:r>
+        <w:rPr>
+          <w:rFonts w:ascii="游ゴシック" w:hAnsi="游ゴシック" w:eastAsia="游ゴシック"/>
+          <w:sz w:val="21"/>
+        </w:rPr>
+        <w:t>自動で git add → commit → push が実行される</w:t>
+      </w:r>
+    </w:p>
+    <w:p>
+      <w:pPr>
+        <w:pStyle w:val="ListNumber"/>
+        <w:spacing w:after="40"/>
+      </w:pPr>
+      <w:r>
+        <w:rPr>
+          <w:rFonts w:ascii="游ゴシック" w:hAnsi="游ゴシック" w:eastAsia="游ゴシック"/>
+          <w:sz w:val="21"/>
+        </w:rPr>
+        <w:t>「Push成功!」が表示されれば完了 → 約1分後に公開URLに反映</w:t>
+      </w:r>
+    </w:p>
+    <w:tbl>
+      <w:tblPr>
+        <w:tblW w:type="auto" w:w="0"/>
+        <w:tblLayout w:type="autofit"/>
+        <w:tblLook w:firstColumn="1" w:firstRow="1" w:lastColumn="0" w:lastRow="0" w:noHBand="0" w:noVBand="1" w:val="04A0"/>
+      </w:tblPr>
+      <w:tblGrid>
+        <w:gridCol w:w="9972"/>
+      </w:tblGrid>
+      <w:tr>
+        <w:tc>
+          <w:tcPr>
+            <w:tcW w:type="dxa" w:w="9972"/>
+            <w:shd w:val="clear" w:color="auto" w:fill="FFF8E1"/>
+            <w:tcBorders>
+              <w:top w:val="single" w:sz="8" w:color="F59E0B"/>
+              <w:left w:val="single" w:sz="8" w:color="F59E0B"/>
+              <w:bottom w:val="single" w:sz="8" w:color="F59E0B"/>
+              <w:right w:val="single" w:sz="8" w:color="F59E0B"/>
+            </w:tcBorders>
+          </w:tcPr>
+          <w:p>
+            <w:r>
+              <w:rPr>
+                <w:rFonts w:ascii="游ゴシック" w:hAnsi="游ゴシック" w:eastAsia="游ゴシック"/>
+                <w:sz w:val="20"/>
+              </w:rPr>
+              <w:t>⚠️ Claudeの作業が終わるまで黒い画面でEnterを押さないでください。更新前の状態でpushしてしまいます。</w:t>
+            </w:r>
+          </w:p>
+        </w:tc>
+      </w:tr>
+    </w:tbl>
+    <w:p/>
+    <w:p>
+      <w:pPr>
+        <w:spacing w:before="160" w:after="40"/>
+      </w:pPr>
+      <w:r>
+        <w:rPr>
+          <w:rFonts w:ascii="游ゴシック" w:hAnsi="游ゴシック" w:eastAsia="游ゴシック"/>
+          <w:b/>
+          <w:color w:val="1E3A8A"/>
+          <w:sz w:val="23"/>
+        </w:rPr>
+        <w:t>■ デスクトップにショートカットを作る</w:t>
+      </w:r>
+    </w:p>
+    <w:p>
+      <w:pPr>
+        <w:pStyle w:val="ListNumber"/>
+        <w:spacing w:after="40"/>
+      </w:pPr>
+      <w:r>
+        <w:rPr>
+          <w:rFonts w:ascii="游ゴシック" w:hAnsi="游ゴシック" w:eastAsia="游ゴシック"/>
+          <w:sz w:val="21"/>
+        </w:rPr>
+        <w:t>「朝の自動更新.bat」を右クリック</w:t>
+      </w:r>
+    </w:p>
+    <w:p>
+      <w:pPr>
+        <w:pStyle w:val="ListNumber"/>
+        <w:spacing w:after="40"/>
+      </w:pPr>
+      <w:r>
+        <w:rPr>
+          <w:rFonts w:ascii="游ゴシック" w:hAnsi="游ゴシック" w:eastAsia="游ゴシック"/>
+          <w:sz w:val="21"/>
+        </w:rPr>
+        <w:t>「ショートカットの作成」を選択</w:t>
+      </w:r>
+    </w:p>
+    <w:p>
+      <w:pPr>
+        <w:pStyle w:val="ListNumber"/>
+        <w:spacing w:after="40"/>
+      </w:pPr>
+      <w:r>
+        <w:rPr>
+          <w:rFonts w:ascii="游ゴシック" w:hAnsi="游ゴシック" w:eastAsia="游ゴシック"/>
+          <w:sz w:val="21"/>
+        </w:rPr>
+        <w:t>作成されたショートカットをデスクトップに移動</w:t>
+      </w:r>
+    </w:p>
+    <w:p>
+      <w:pPr>
+        <w:pStyle w:val="ListNumber"/>
+        <w:spacing w:after="40"/>
+      </w:pPr>
+      <w:r>
+        <w:rPr>
+          <w:rFonts w:ascii="游ゴシック" w:hAnsi="游ゴシック" w:eastAsia="游ゴシック"/>
+          <w:sz w:val="21"/>
+        </w:rPr>
+        <w:t>毎朝デスクトップから1クリックで起動可能</w:t>
+      </w:r>
+    </w:p>
+    <w:p>
+      <w:pPr>
+        <w:spacing w:before="240" w:after="80"/>
+      </w:pPr>
+      <w:r>
+        <w:rPr>
+          <w:rFonts w:ascii="游ゴシック" w:hAnsi="游ゴシック" w:eastAsia="游ゴシック"/>
+          <w:b/>
+          <w:color w:val="333333"/>
+          <w:sz w:val="27"/>
+        </w:rPr>
+        <w:t>6-4. パターンC：タスクスケジューラ自動起動の手順</w:t>
+      </w:r>
+    </w:p>
+    <w:p>
+      <w:pPr>
+        <w:spacing w:after="80"/>
+      </w:pPr>
+      <w:r>
+        <w:rPr>
+          <w:rFonts w:ascii="游ゴシック" w:hAnsi="游ゴシック" w:eastAsia="游ゴシック"/>
+          <w:b w:val="0"/>
+          <w:sz w:val="21"/>
+        </w:rPr>
+        <w:t>毎朝7時に「朝の自動更新.bat」を自動起動させます。PCが起動中である必要があります。詳細セットアップは第7章を参照。</w:t>
+      </w:r>
+    </w:p>
+    <w:p>
+      <w:pPr>
+        <w:spacing w:before="160" w:after="40"/>
+      </w:pPr>
+      <w:r>
+        <w:rPr>
+          <w:rFonts w:ascii="游ゴシック" w:hAnsi="游ゴシック" w:eastAsia="游ゴシック"/>
+          <w:b/>
+          <w:color w:val="1E3A8A"/>
+          <w:sz w:val="23"/>
+        </w:rPr>
+        <w:t>■ 初回セットアップ（1回だけ）</w:t>
+      </w:r>
+    </w:p>
+    <w:p>
+      <w:pPr>
+        <w:pStyle w:val="ListNumber"/>
+        <w:spacing w:after="40"/>
+      </w:pPr>
+      <w:r>
+        <w:rPr>
+          <w:rFonts w:ascii="游ゴシック" w:hAnsi="游ゴシック" w:eastAsia="游ゴシック"/>
+          <w:sz w:val="21"/>
+        </w:rPr>
+        <w:t>「タスクスケジューラ_設定.bat」をダブルクリック</w:t>
+      </w:r>
+    </w:p>
+    <w:p>
+      <w:pPr>
+        <w:pStyle w:val="ListNumber"/>
+        <w:spacing w:after="40"/>
+      </w:pPr>
+      <w:r>
+        <w:rPr>
+          <w:rFonts w:ascii="游ゴシック" w:hAnsi="游ゴシック" w:eastAsia="游ゴシック"/>
+          <w:sz w:val="21"/>
+        </w:rPr>
+        <w:t>確認メッセージで「Y」を押す</w:t>
+      </w:r>
+    </w:p>
+    <w:p>
+      <w:pPr>
+        <w:pStyle w:val="ListNumber"/>
+        <w:spacing w:after="40"/>
+      </w:pPr>
+      <w:r>
+        <w:rPr>
+          <w:rFonts w:ascii="游ゴシック" w:hAnsi="游ゴシック" w:eastAsia="游ゴシック"/>
+          <w:sz w:val="21"/>
+        </w:rPr>
+        <w:t>「設定完了!」と表示されたら登録完了</w:t>
+      </w:r>
+    </w:p>
+    <w:p>
+      <w:pPr>
+        <w:spacing w:before="160" w:after="40"/>
+      </w:pPr>
+      <w:r>
+        <w:rPr>
+          <w:rFonts w:ascii="游ゴシック" w:hAnsi="游ゴシック" w:eastAsia="游ゴシック"/>
+          <w:b/>
+          <w:color w:val="1E3A8A"/>
+          <w:sz w:val="23"/>
+        </w:rPr>
+        <w:t>■ 毎朝の動作（自動）</w:t>
+      </w:r>
+    </w:p>
+    <w:p>
+      <w:pPr>
+        <w:pStyle w:val="ListNumber"/>
+        <w:spacing w:after="40"/>
+      </w:pPr>
+      <w:r>
+        <w:rPr>
+          <w:rFonts w:ascii="游ゴシック" w:hAnsi="游ゴシック" w:eastAsia="游ゴシック"/>
+          <w:sz w:val="21"/>
+        </w:rPr>
+        <w:t>【7:00】タスクスケジューラが「朝の自動更新.bat」を自動起動</w:t>
+      </w:r>
+    </w:p>
+    <w:p>
+      <w:pPr>
+        <w:pStyle w:val="ListNumber"/>
+        <w:spacing w:after="40"/>
+      </w:pPr>
+      <w:r>
+        <w:rPr>
+          <w:rFonts w:ascii="游ゴシック" w:hAnsi="游ゴシック" w:eastAsia="游ゴシック"/>
+          <w:sz w:val="21"/>
+        </w:rPr>
+        <w:t>【7:00】通知が表示され、Claude Codeが自動起動</w:t>
+      </w:r>
+    </w:p>
+    <w:p>
+      <w:pPr>
+        <w:pStyle w:val="ListNumber"/>
+        <w:spacing w:after="40"/>
+      </w:pPr>
+      <w:r>
+        <w:rPr>
+          <w:rFonts w:ascii="游ゴシック" w:hAnsi="游ゴシック" w:eastAsia="游ゴシック"/>
+          <w:sz w:val="21"/>
+        </w:rPr>
+        <w:t>【あなた】「定例報告」と入力 → Enter</w:t>
+      </w:r>
+    </w:p>
+    <w:p>
+      <w:pPr>
+        <w:pStyle w:val="ListNumber"/>
+        <w:spacing w:after="40"/>
+      </w:pPr>
+      <w:r>
+        <w:rPr>
+          <w:rFonts w:ascii="游ゴシック" w:hAnsi="游ゴシック" w:eastAsia="游ゴシック"/>
+          <w:sz w:val="21"/>
+        </w:rPr>
+        <w:t>【あなた】Claude更新完了後、黒い画面でEnter</w:t>
+      </w:r>
+    </w:p>
+    <w:p>
+      <w:pPr>
+        <w:pStyle w:val="ListNumber"/>
+        <w:spacing w:after="40"/>
+      </w:pPr>
+      <w:r>
+        <w:rPr>
+          <w:rFonts w:ascii="游ゴシック" w:hAnsi="游ゴシック" w:eastAsia="游ゴシック"/>
+          <w:sz w:val="21"/>
+        </w:rPr>
+        <w:t>【自動】git push → GitHub Pages公開</w:t>
+      </w:r>
+    </w:p>
+    <w:tbl>
+      <w:tblPr>
+        <w:tblW w:type="auto" w:w="0"/>
+        <w:tblLayout w:type="autofit"/>
+        <w:tblLook w:firstColumn="1" w:firstRow="1" w:lastColumn="0" w:lastRow="0" w:noHBand="0" w:noVBand="1" w:val="04A0"/>
+      </w:tblPr>
+      <w:tblGrid>
+        <w:gridCol w:w="9972"/>
+      </w:tblGrid>
+      <w:tr>
+        <w:tc>
+          <w:tcPr>
+            <w:tcW w:type="dxa" w:w="9972"/>
+            <w:shd w:val="clear" w:color="auto" w:fill="FFF8E1"/>
+            <w:tcBorders>
+              <w:top w:val="single" w:sz="8" w:color="F59E0B"/>
+              <w:left w:val="single" w:sz="8" w:color="F59E0B"/>
+              <w:bottom w:val="single" w:sz="8" w:color="F59E0B"/>
+              <w:right w:val="single" w:sz="8" w:color="F59E0B"/>
+            </w:tcBorders>
+          </w:tcPr>
+          <w:p>
+            <w:r>
+              <w:rPr>
+                <w:rFonts w:ascii="游ゴシック" w:hAnsi="游ゴシック" w:eastAsia="游ゴシック"/>
+                <w:sz w:val="20"/>
+              </w:rPr>
+              <w:t>💡 PCが起動中でないと動きません。スリープ復帰や夜間シャットダウンに注意。</w:t>
+            </w:r>
+          </w:p>
+        </w:tc>
+      </w:tr>
+    </w:tbl>
+    <w:p/>
+    <w:p>
+      <w:pPr>
+        <w:spacing w:before="240" w:after="80"/>
+      </w:pPr>
+      <w:r>
+        <w:rPr>
+          <w:rFonts w:ascii="游ゴシック" w:hAnsi="游ゴシック" w:eastAsia="游ゴシック"/>
+          <w:b/>
+          <w:color w:val="333333"/>
+          <w:sz w:val="27"/>
+        </w:rPr>
+        <w:t>6-5. パターンD：/schedule（クラウド完全自動・将来）</w:t>
+      </w:r>
+    </w:p>
+    <w:p>
+      <w:pPr>
+        <w:spacing w:after="80"/>
+      </w:pPr>
+      <w:r>
+        <w:rPr>
+          <w:rFonts w:ascii="游ゴシック" w:hAnsi="游ゴシック" w:eastAsia="游ゴシック"/>
+          <w:b w:val="0"/>
+          <w:sz w:val="21"/>
+        </w:rPr>
+        <w:t>Claude Code の /schedule 機能を使うと、クラウド側で完全自動実行されPC起動不要になります。現在は利用不可ですが、復活したら最強の方法です。</w:t>
+      </w:r>
+    </w:p>
+    <w:p>
+      <w:pPr>
+        <w:pStyle w:val="ListBullet"/>
+        <w:spacing w:after="40"/>
+      </w:pPr>
+      <w:r>
+        <w:rPr>
+          <w:rFonts w:ascii="游ゴシック" w:hAnsi="游ゴシック" w:eastAsia="游ゴシック"/>
+          <w:sz w:val="21"/>
+        </w:rPr>
+        <w:t>毎朝7時にクラウドが自動でClaude を起動</w:t>
+      </w:r>
+    </w:p>
+    <w:p>
+      <w:pPr>
+        <w:pStyle w:val="ListBullet"/>
+        <w:spacing w:after="40"/>
+      </w:pPr>
+      <w:r>
+        <w:rPr>
+          <w:rFonts w:ascii="游ゴシック" w:hAnsi="游ゴシック" w:eastAsia="游ゴシック"/>
+          <w:sz w:val="21"/>
+        </w:rPr>
+        <w:t>プロンプト（_自動更新の指示プロンプト.md の内容）を自動投入</w:t>
+      </w:r>
+    </w:p>
+    <w:p>
+      <w:pPr>
+        <w:pStyle w:val="ListBullet"/>
+        <w:spacing w:after="40"/>
+      </w:pPr>
+      <w:r>
+        <w:rPr>
+          <w:rFonts w:ascii="游ゴシック" w:hAnsi="游ゴシック" w:eastAsia="游ゴシック"/>
+          <w:sz w:val="21"/>
+        </w:rPr>
+        <w:t>Claudeが自動でニュース取得＋index.html更新＋git push</w:t>
+      </w:r>
+    </w:p>
+    <w:p>
+      <w:pPr>
+        <w:pStyle w:val="ListBullet"/>
+        <w:spacing w:after="40"/>
+      </w:pPr>
+      <w:r>
+        <w:rPr>
+          <w:rFonts w:ascii="游ゴシック" w:hAnsi="游ゴシック" w:eastAsia="游ゴシック"/>
+          <w:sz w:val="21"/>
+        </w:rPr>
+        <w:t>PC不要・操作不要・完全自動</w:t>
+      </w:r>
+    </w:p>
+    <w:tbl>
+      <w:tblPr>
+        <w:tblW w:type="auto" w:w="0"/>
+        <w:tblLayout w:type="autofit"/>
+        <w:tblLook w:firstColumn="1" w:firstRow="1" w:lastColumn="0" w:lastRow="0" w:noHBand="0" w:noVBand="1" w:val="04A0"/>
+      </w:tblPr>
+      <w:tblGrid>
+        <w:gridCol w:w="9972"/>
+      </w:tblGrid>
+      <w:tr>
+        <w:tc>
+          <w:tcPr>
+            <w:tcW w:type="dxa" w:w="9972"/>
+            <w:shd w:val="clear" w:color="auto" w:fill="FFF8E1"/>
+            <w:tcBorders>
+              <w:top w:val="single" w:sz="8" w:color="F59E0B"/>
+              <w:left w:val="single" w:sz="8" w:color="F59E0B"/>
+              <w:bottom w:val="single" w:sz="8" w:color="F59E0B"/>
+              <w:right w:val="single" w:sz="8" w:color="F59E0B"/>
+            </w:tcBorders>
+          </w:tcPr>
+          <w:p>
+            <w:r>
+              <w:rPr>
+                <w:rFonts w:ascii="游ゴシック" w:hAnsi="游ゴシック" w:eastAsia="游ゴシック"/>
+                <w:sz w:val="20"/>
+              </w:rPr>
+              <w:t>📅 /schedule復活時の移行手順は第7章「7-2」を参照。</w:t>
+            </w:r>
+          </w:p>
+        </w:tc>
+      </w:tr>
+    </w:tbl>
+    <w:p/>
+    <w:p>
+      <w:pPr>
+        <w:spacing w:before="240" w:after="80"/>
+      </w:pPr>
+      <w:r>
+        <w:rPr>
+          <w:rFonts w:ascii="游ゴシック" w:hAnsi="游ゴシック" w:eastAsia="游ゴシック"/>
+          <w:b/>
+          <w:color w:val="333333"/>
+          <w:sz w:val="27"/>
+        </w:rPr>
+        <w:t>6-6. ニュース項目を変更する場合</w:t>
       </w:r>
     </w:p>
     <w:p>
@@ -2871,7 +3825,7 @@
           <w:color w:val="333333"/>
           <w:sz w:val="27"/>
         </w:rPr>
-        <w:t>6-3. 日付表示の見方</w:t>
+        <w:t>6-7. 日付表示の見方</w:t>
       </w:r>
     </w:p>
     <w:p>
@@ -3130,7 +4084,7 @@
           <w:color w:val="333333"/>
           <w:sz w:val="27"/>
         </w:rPr>
-        <w:t>6-4. 税制改正の年度切替について</w:t>
+        <w:t>6-8. 税制改正の年度切替について</w:t>
       </w:r>
     </w:p>
     <w:p>
@@ -3557,7 +4511,7 @@
           <w:color w:val="333333"/>
           <w:sz w:val="27"/>
         </w:rPr>
-        <w:t>6-5. 新年度データを追加する方法</w:t>
+        <w:t>6-9. 新年度データを追加する方法</w:t>
       </w:r>
     </w:p>
     <w:p>
@@ -3716,7 +4670,7 @@
           <w:color w:val="333333"/>
           <w:sz w:val="27"/>
         </w:rPr>
-        <w:t>6-6. データ未追加の警告が出たら</w:t>
+        <w:t>6-10. データ未追加の警告が出たら</w:t>
       </w:r>
     </w:p>
     <w:p>

</xml_diff>

<commit_message>
Integrate news item replacement into pattern A as supplementary note
</commit_message>
<xml_diff>
--- a/定例報告_運用手順書.docx
+++ b/定例報告_運用手順書.docx
@@ -3199,6 +3199,106 @@
     <w:p/>
     <w:p>
       <w:pPr>
+        <w:spacing w:before="160" w:after="40"/>
+      </w:pPr>
+      <w:r>
+        <w:rPr>
+          <w:rFonts w:ascii="游ゴシック" w:hAnsi="游ゴシック" w:eastAsia="游ゴシック"/>
+          <w:b/>
+          <w:color w:val="1E3A8A"/>
+          <w:sz w:val="23"/>
+        </w:rPr>
+        <w:t>■ 補足：個別ニュースの差し替え</w:t>
+      </w:r>
+    </w:p>
+    <w:p>
+      <w:pPr>
+        <w:spacing w:after="80"/>
+      </w:pPr>
+      <w:r>
+        <w:rPr>
+          <w:rFonts w:ascii="游ゴシック" w:hAnsi="游ゴシック" w:eastAsia="游ゴシック"/>
+          <w:b w:val="0"/>
+          <w:sz w:val="21"/>
+        </w:rPr>
+        <w:t>日次更新後、特定のニュース項目だけを差し替えたい場合（例：昼に重要ニュース発表→朝の5件のうち1つを差し替え）：</w:t>
+      </w:r>
+    </w:p>
+    <w:p>
+      <w:pPr>
+        <w:pStyle w:val="ListBullet"/>
+        <w:spacing w:after="40"/>
+      </w:pPr>
+      <w:r>
+        <w:rPr>
+          <w:rFonts w:ascii="游ゴシック" w:hAnsi="游ゴシック" w:eastAsia="游ゴシック"/>
+          <w:sz w:val="21"/>
+        </w:rPr>
+        <w:t>Claudeに「○○のニュースに差し替えて」「3番目を○○に変更」などと依頼</w:t>
+      </w:r>
+    </w:p>
+    <w:p>
+      <w:pPr>
+        <w:pStyle w:val="ListBullet"/>
+        <w:spacing w:after="40"/>
+      </w:pPr>
+      <w:r>
+        <w:rPr>
+          <w:rFonts w:ascii="游ゴシック" w:hAnsi="游ゴシック" w:eastAsia="游ゴシック"/>
+          <w:sz w:val="21"/>
+        </w:rPr>
+        <w:t>Claudeが該当ニュースだけ書き換え（他は維持）</w:t>
+      </w:r>
+    </w:p>
+    <w:p>
+      <w:pPr>
+        <w:pStyle w:val="ListBullet"/>
+        <w:spacing w:after="40"/>
+      </w:pPr>
+      <w:r>
+        <w:rPr>
+          <w:rFonts w:ascii="游ゴシック" w:hAnsi="游ゴシック" w:eastAsia="游ゴシック"/>
+          <w:sz w:val="21"/>
+        </w:rPr>
+        <w:t>更新後、「GitHubに更新.bat」をダブルクリックでpush公開</w:t>
+      </w:r>
+    </w:p>
+    <w:tbl>
+      <w:tblPr>
+        <w:tblW w:type="auto" w:w="0"/>
+        <w:tblLayout w:type="autofit"/>
+        <w:tblLook w:firstColumn="1" w:firstRow="1" w:lastColumn="0" w:lastRow="0" w:noHBand="0" w:noVBand="1" w:val="04A0"/>
+      </w:tblPr>
+      <w:tblGrid>
+        <w:gridCol w:w="9972"/>
+      </w:tblGrid>
+      <w:tr>
+        <w:tc>
+          <w:tcPr>
+            <w:tcW w:type="dxa" w:w="9972"/>
+            <w:shd w:val="clear" w:color="auto" w:fill="FFF8E1"/>
+            <w:tcBorders>
+              <w:top w:val="single" w:sz="8" w:color="F59E0B"/>
+              <w:left w:val="single" w:sz="8" w:color="F59E0B"/>
+              <w:bottom w:val="single" w:sz="8" w:color="F59E0B"/>
+              <w:right w:val="single" w:sz="8" w:color="F59E0B"/>
+            </w:tcBorders>
+          </w:tcPr>
+          <w:p>
+            <w:r>
+              <w:rPr>
+                <w:rFonts w:ascii="游ゴシック" w:hAnsi="游ゴシック" w:eastAsia="游ゴシック"/>
+                <w:sz w:val="20"/>
+              </w:rPr>
+              <w:t>💡 全件を新しい内容で書き換えたい場合は「定例報告」と入力し直してください。</w:t>
+            </w:r>
+          </w:p>
+        </w:tc>
+      </w:tr>
+    </w:tbl>
+    <w:p/>
+    <w:p>
+      <w:pPr>
         <w:spacing w:before="240" w:after="80"/>
       </w:pPr>
       <w:r>
@@ -3772,60 +3872,7 @@
           <w:color w:val="333333"/>
           <w:sz w:val="27"/>
         </w:rPr>
-        <w:t>6-6. ニュース項目を変更する場合</w:t>
-      </w:r>
-    </w:p>
-    <w:p>
-      <w:pPr>
-        <w:pStyle w:val="ListBullet"/>
-        <w:spacing w:after="40"/>
-      </w:pPr>
-      <w:r>
-        <w:rPr>
-          <w:rFonts w:ascii="游ゴシック" w:hAnsi="游ゴシック" w:eastAsia="游ゴシック"/>
-          <w:sz w:val="21"/>
-        </w:rPr>
-        <w:t>Claudeに「○○のニュースに差し替えて」と依頼</w:t>
-      </w:r>
-    </w:p>
-    <w:p>
-      <w:pPr>
-        <w:pStyle w:val="ListBullet"/>
-        <w:spacing w:after="40"/>
-      </w:pPr>
-      <w:r>
-        <w:rPr>
-          <w:rFonts w:ascii="游ゴシック" w:hAnsi="游ゴシック" w:eastAsia="游ゴシック"/>
-          <w:sz w:val="21"/>
-        </w:rPr>
-        <w:t>Claudeが index.html を直接編集</w:t>
-      </w:r>
-    </w:p>
-    <w:p>
-      <w:pPr>
-        <w:pStyle w:val="ListBullet"/>
-        <w:spacing w:after="40"/>
-      </w:pPr>
-      <w:r>
-        <w:rPr>
-          <w:rFonts w:ascii="游ゴシック" w:hAnsi="游ゴシック" w:eastAsia="游ゴシック"/>
-          <w:sz w:val="21"/>
-        </w:rPr>
-        <w:t>更新後、「GitHubに更新.bat」をダブルクリックでpush公開</w:t>
-      </w:r>
-    </w:p>
-    <w:p>
-      <w:pPr>
-        <w:spacing w:before="240" w:after="80"/>
-      </w:pPr>
-      <w:r>
-        <w:rPr>
-          <w:rFonts w:ascii="游ゴシック" w:hAnsi="游ゴシック" w:eastAsia="游ゴシック"/>
-          <w:b/>
-          <w:color w:val="333333"/>
-          <w:sz w:val="27"/>
-        </w:rPr>
-        <w:t>6-7. 日付表示の見方</w:t>
+        <w:t>6-6. 日付表示の見方</w:t>
       </w:r>
     </w:p>
     <w:p>
@@ -4084,7 +4131,7 @@
           <w:color w:val="333333"/>
           <w:sz w:val="27"/>
         </w:rPr>
-        <w:t>6-8. 税制改正の年度切替について</w:t>
+        <w:t>6-7. 税制改正の年度切替について</w:t>
       </w:r>
     </w:p>
     <w:p>
@@ -4511,7 +4558,7 @@
           <w:color w:val="333333"/>
           <w:sz w:val="27"/>
         </w:rPr>
-        <w:t>6-9. 新年度データを追加する方法</w:t>
+        <w:t>6-8. 新年度データを追加する方法</w:t>
       </w:r>
     </w:p>
     <w:p>
@@ -4670,7 +4717,7 @@
           <w:color w:val="333333"/>
           <w:sz w:val="27"/>
         </w:rPr>
-        <w:t>6-10. データ未追加の警告が出たら</w:t>
+        <w:t>6-9. データ未追加の警告が出たら</w:t>
       </w:r>
     </w:p>
     <w:p>

</xml_diff>